<commit_message>
fix(deploy): resolved admin pages ui bugs
</commit_message>
<xml_diff>
--- a/docs/user-guides/vista-working-and-demo-guide.docx
+++ b/docs/user-guides/vista-working-and-demo-guide.docx
@@ -93,6 +93,7 @@
             <w:pPr>
               <w:pStyle w:val="Normal"/>
               <w:widowControl/>
+              <w:suppressAutoHyphens w:val="true"/>
               <w:spacing w:before="0" w:after="120"/>
               <w:jc w:val="left"/>
               <w:rPr>
@@ -126,6 +127,7 @@
             <w:pPr>
               <w:pStyle w:val="Normal"/>
               <w:widowControl/>
+              <w:suppressAutoHyphens w:val="true"/>
               <w:spacing w:before="0" w:after="120"/>
               <w:jc w:val="left"/>
               <w:rPr>
@@ -159,6 +161,7 @@
             <w:pPr>
               <w:pStyle w:val="Normal"/>
               <w:widowControl/>
+              <w:suppressAutoHyphens w:val="true"/>
               <w:spacing w:before="0" w:after="120"/>
               <w:jc w:val="left"/>
               <w:rPr>
@@ -194,6 +197,7 @@
             <w:pPr>
               <w:pStyle w:val="Normal"/>
               <w:widowControl/>
+              <w:suppressAutoHyphens w:val="true"/>
               <w:spacing w:before="0" w:after="0"/>
               <w:jc w:val="left"/>
               <w:rPr>
@@ -224,6 +228,7 @@
             <w:pPr>
               <w:pStyle w:val="Normal"/>
               <w:widowControl/>
+              <w:suppressAutoHyphens w:val="true"/>
               <w:spacing w:before="0" w:after="0"/>
               <w:jc w:val="left"/>
               <w:rPr>
@@ -254,6 +259,7 @@
             <w:pPr>
               <w:pStyle w:val="Normal"/>
               <w:widowControl/>
+              <w:suppressAutoHyphens w:val="true"/>
               <w:spacing w:before="0" w:after="0"/>
               <w:jc w:val="left"/>
               <w:rPr>
@@ -288,6 +294,7 @@
             <w:pPr>
               <w:pStyle w:val="Normal"/>
               <w:widowControl/>
+              <w:suppressAutoHyphens w:val="true"/>
               <w:spacing w:before="0" w:after="0"/>
               <w:jc w:val="left"/>
               <w:rPr>
@@ -319,6 +326,7 @@
             <w:pPr>
               <w:pStyle w:val="Normal"/>
               <w:widowControl/>
+              <w:suppressAutoHyphens w:val="true"/>
               <w:spacing w:before="0" w:after="0"/>
               <w:jc w:val="left"/>
               <w:rPr>
@@ -350,6 +358,7 @@
             <w:pPr>
               <w:pStyle w:val="Normal"/>
               <w:widowControl/>
+              <w:suppressAutoHyphens w:val="true"/>
               <w:spacing w:before="0" w:after="0"/>
               <w:jc w:val="left"/>
               <w:rPr>
@@ -383,6 +392,7 @@
             <w:pPr>
               <w:pStyle w:val="Normal"/>
               <w:widowControl/>
+              <w:suppressAutoHyphens w:val="true"/>
               <w:spacing w:before="0" w:after="0"/>
               <w:jc w:val="left"/>
               <w:rPr>
@@ -413,6 +423,7 @@
             <w:pPr>
               <w:pStyle w:val="Normal"/>
               <w:widowControl/>
+              <w:suppressAutoHyphens w:val="true"/>
               <w:spacing w:before="0" w:after="0"/>
               <w:jc w:val="left"/>
               <w:rPr>
@@ -443,6 +454,7 @@
             <w:pPr>
               <w:pStyle w:val="Normal"/>
               <w:widowControl/>
+              <w:suppressAutoHyphens w:val="true"/>
               <w:spacing w:before="0" w:after="0"/>
               <w:jc w:val="left"/>
               <w:rPr>
@@ -531,6 +543,7 @@
             <w:pPr>
               <w:pStyle w:val="Normal"/>
               <w:widowControl/>
+              <w:suppressAutoHyphens w:val="true"/>
               <w:spacing w:before="0" w:after="120"/>
               <w:jc w:val="left"/>
               <w:rPr>
@@ -564,6 +577,7 @@
             <w:pPr>
               <w:pStyle w:val="Normal"/>
               <w:widowControl/>
+              <w:suppressAutoHyphens w:val="true"/>
               <w:spacing w:before="0" w:after="120"/>
               <w:jc w:val="left"/>
               <w:rPr>
@@ -599,6 +613,7 @@
             <w:pPr>
               <w:pStyle w:val="Normal"/>
               <w:widowControl/>
+              <w:suppressAutoHyphens w:val="true"/>
               <w:spacing w:before="0" w:after="0"/>
               <w:jc w:val="left"/>
               <w:rPr>
@@ -629,6 +644,7 @@
             <w:pPr>
               <w:pStyle w:val="Normal"/>
               <w:widowControl/>
+              <w:suppressAutoHyphens w:val="true"/>
               <w:spacing w:before="0" w:after="0"/>
               <w:jc w:val="left"/>
               <w:rPr>
@@ -663,6 +679,7 @@
             <w:pPr>
               <w:pStyle w:val="Normal"/>
               <w:widowControl/>
+              <w:suppressAutoHyphens w:val="true"/>
               <w:spacing w:before="0" w:after="0"/>
               <w:jc w:val="left"/>
               <w:rPr>
@@ -694,6 +711,7 @@
             <w:pPr>
               <w:pStyle w:val="Normal"/>
               <w:widowControl/>
+              <w:suppressAutoHyphens w:val="true"/>
               <w:spacing w:before="0" w:after="0"/>
               <w:jc w:val="left"/>
               <w:rPr>
@@ -727,6 +745,7 @@
             <w:pPr>
               <w:pStyle w:val="Normal"/>
               <w:widowControl/>
+              <w:suppressAutoHyphens w:val="true"/>
               <w:spacing w:before="0" w:after="0"/>
               <w:jc w:val="left"/>
               <w:rPr>
@@ -757,6 +776,7 @@
             <w:pPr>
               <w:pStyle w:val="Normal"/>
               <w:widowControl/>
+              <w:suppressAutoHyphens w:val="true"/>
               <w:spacing w:before="0" w:after="0"/>
               <w:jc w:val="left"/>
               <w:rPr>
@@ -791,6 +811,7 @@
             <w:pPr>
               <w:pStyle w:val="Normal"/>
               <w:widowControl/>
+              <w:suppressAutoHyphens w:val="true"/>
               <w:spacing w:before="0" w:after="0"/>
               <w:jc w:val="left"/>
               <w:rPr>
@@ -822,6 +843,7 @@
             <w:pPr>
               <w:pStyle w:val="Normal"/>
               <w:widowControl/>
+              <w:suppressAutoHyphens w:val="true"/>
               <w:spacing w:before="0" w:after="0"/>
               <w:jc w:val="left"/>
               <w:rPr>
@@ -855,6 +877,7 @@
             <w:pPr>
               <w:pStyle w:val="Normal"/>
               <w:widowControl/>
+              <w:suppressAutoHyphens w:val="true"/>
               <w:spacing w:before="0" w:after="0"/>
               <w:jc w:val="left"/>
               <w:rPr>
@@ -885,6 +908,7 @@
             <w:pPr>
               <w:pStyle w:val="Normal"/>
               <w:widowControl/>
+              <w:suppressAutoHyphens w:val="true"/>
               <w:spacing w:before="0" w:after="0"/>
               <w:jc w:val="left"/>
               <w:rPr>
@@ -919,6 +943,7 @@
             <w:pPr>
               <w:pStyle w:val="Normal"/>
               <w:widowControl/>
+              <w:suppressAutoHyphens w:val="true"/>
               <w:spacing w:before="0" w:after="0"/>
               <w:jc w:val="left"/>
               <w:rPr>
@@ -950,6 +975,7 @@
             <w:pPr>
               <w:pStyle w:val="Normal"/>
               <w:widowControl/>
+              <w:suppressAutoHyphens w:val="true"/>
               <w:spacing w:before="0" w:after="0"/>
               <w:jc w:val="left"/>
               <w:rPr>
@@ -983,6 +1009,7 @@
             <w:pPr>
               <w:pStyle w:val="Normal"/>
               <w:widowControl/>
+              <w:suppressAutoHyphens w:val="true"/>
               <w:spacing w:before="0" w:after="0"/>
               <w:jc w:val="left"/>
               <w:rPr>
@@ -1013,6 +1040,7 @@
             <w:pPr>
               <w:pStyle w:val="Normal"/>
               <w:widowControl/>
+              <w:suppressAutoHyphens w:val="true"/>
               <w:spacing w:before="0" w:after="0"/>
               <w:jc w:val="left"/>
               <w:rPr>
@@ -1047,6 +1075,7 @@
             <w:pPr>
               <w:pStyle w:val="Normal"/>
               <w:widowControl/>
+              <w:suppressAutoHyphens w:val="true"/>
               <w:spacing w:before="0" w:after="0"/>
               <w:jc w:val="left"/>
               <w:rPr>
@@ -1078,6 +1107,7 @@
             <w:pPr>
               <w:pStyle w:val="Normal"/>
               <w:widowControl/>
+              <w:suppressAutoHyphens w:val="true"/>
               <w:spacing w:before="0" w:after="0"/>
               <w:jc w:val="left"/>
               <w:rPr>
@@ -1111,6 +1141,7 @@
             <w:pPr>
               <w:pStyle w:val="Normal"/>
               <w:widowControl/>
+              <w:suppressAutoHyphens w:val="true"/>
               <w:spacing w:before="0" w:after="0"/>
               <w:jc w:val="left"/>
               <w:rPr>
@@ -1141,6 +1172,7 @@
             <w:pPr>
               <w:pStyle w:val="Normal"/>
               <w:widowControl/>
+              <w:suppressAutoHyphens w:val="true"/>
               <w:spacing w:before="0" w:after="0"/>
               <w:jc w:val="left"/>
               <w:rPr>
@@ -1175,6 +1207,7 @@
             <w:pPr>
               <w:pStyle w:val="Normal"/>
               <w:widowControl/>
+              <w:suppressAutoHyphens w:val="true"/>
               <w:spacing w:before="0" w:after="0"/>
               <w:jc w:val="left"/>
               <w:rPr>
@@ -1206,6 +1239,7 @@
             <w:pPr>
               <w:pStyle w:val="Normal"/>
               <w:widowControl/>
+              <w:suppressAutoHyphens w:val="true"/>
               <w:spacing w:before="0" w:after="0"/>
               <w:jc w:val="left"/>
               <w:rPr>
@@ -1239,6 +1273,7 @@
             <w:pPr>
               <w:pStyle w:val="Normal"/>
               <w:widowControl/>
+              <w:suppressAutoHyphens w:val="true"/>
               <w:spacing w:before="0" w:after="0"/>
               <w:jc w:val="left"/>
               <w:rPr>
@@ -1269,6 +1304,7 @@
             <w:pPr>
               <w:pStyle w:val="Normal"/>
               <w:widowControl/>
+              <w:suppressAutoHyphens w:val="true"/>
               <w:spacing w:before="0" w:after="0"/>
               <w:jc w:val="left"/>
               <w:rPr>
@@ -1303,6 +1339,7 @@
             <w:pPr>
               <w:pStyle w:val="Normal"/>
               <w:widowControl/>
+              <w:suppressAutoHyphens w:val="true"/>
               <w:spacing w:before="0" w:after="0"/>
               <w:jc w:val="left"/>
               <w:rPr>
@@ -1334,6 +1371,7 @@
             <w:pPr>
               <w:pStyle w:val="Normal"/>
               <w:widowControl/>
+              <w:suppressAutoHyphens w:val="true"/>
               <w:spacing w:before="0" w:after="0"/>
               <w:jc w:val="left"/>
               <w:rPr>
@@ -1367,6 +1405,7 @@
             <w:pPr>
               <w:pStyle w:val="Normal"/>
               <w:widowControl/>
+              <w:suppressAutoHyphens w:val="true"/>
               <w:spacing w:before="0" w:after="0"/>
               <w:jc w:val="left"/>
               <w:rPr>
@@ -1397,6 +1436,7 @@
             <w:pPr>
               <w:pStyle w:val="Normal"/>
               <w:widowControl/>
+              <w:suppressAutoHyphens w:val="true"/>
               <w:spacing w:before="0" w:after="0"/>
               <w:jc w:val="left"/>
               <w:rPr>
@@ -1733,6 +1773,7 @@
     <w:p>
       <w:pPr>
         <w:pStyle w:val="Heading3"/>
+        <w:spacing w:before="0" w:after="100"/>
         <w:rPr/>
       </w:pPr>
       <w:r>
@@ -2153,6 +2194,52 @@
           <w:color w:val="545F58"/>
           <w:sz w:val="19"/>
         </w:rPr>
+        <w:drawing>
+          <wp:anchor behindDoc="0" distT="0" distB="0" distL="0" distR="0" simplePos="0" locked="0" layoutInCell="0" allowOverlap="1" relativeHeight="4">
+            <wp:simplePos x="0" y="0"/>
+            <wp:positionH relativeFrom="column">
+              <wp:align>center</wp:align>
+            </wp:positionH>
+            <wp:positionV relativeFrom="paragraph">
+              <wp:posOffset>635</wp:posOffset>
+            </wp:positionV>
+            <wp:extent cx="6272530" cy="2964180"/>
+            <wp:effectExtent l="0" t="0" r="0" b="0"/>
+            <wp:wrapSquare wrapText="largest"/>
+            <wp:docPr id="3" name="Image3" descr=""/>
+            <wp:cNvGraphicFramePr>
+              <a:graphicFrameLocks xmlns:a="http://schemas.openxmlformats.org/drawingml/2006/main" noChangeAspect="1"/>
+            </wp:cNvGraphicFramePr>
+            <a:graphic xmlns:a="http://schemas.openxmlformats.org/drawingml/2006/main">
+              <a:graphicData uri="http://schemas.openxmlformats.org/drawingml/2006/picture">
+                <pic:pic xmlns:pic="http://schemas.openxmlformats.org/drawingml/2006/picture">
+                  <pic:nvPicPr>
+                    <pic:cNvPr id="3" name="Image3" descr=""/>
+                    <pic:cNvPicPr>
+                      <a:picLocks noChangeAspect="1" noChangeArrowheads="1"/>
+                    </pic:cNvPicPr>
+                  </pic:nvPicPr>
+                  <pic:blipFill>
+                    <a:blip r:embed="rId4"/>
+                    <a:stretch>
+                      <a:fillRect/>
+                    </a:stretch>
+                  </pic:blipFill>
+                  <pic:spPr bwMode="auto">
+                    <a:xfrm>
+                      <a:off x="0" y="0"/>
+                      <a:ext cx="6272530" cy="2964180"/>
+                    </a:xfrm>
+                    <a:prstGeom prst="rect">
+                      <a:avLst/>
+                    </a:prstGeom>
+                    <a:noFill/>
+                  </pic:spPr>
+                </pic:pic>
+              </a:graphicData>
+            </a:graphic>
+          </wp:anchor>
+        </w:drawing>
       </w:r>
     </w:p>
     <w:p>
@@ -2257,120 +2344,12 @@
         <w:keepNext w:val="false"/>
         <w:keepLines/>
         <w:spacing w:before="80" w:after="200"/>
-        <w:rPr/>
-      </w:pPr>
-      <w:r>
-        <w:rPr>
+        <w:rPr>
+          <w:i/>
           <w:i/>
           <w:color w:val="545F58"/>
           <w:sz w:val="19"/>
         </w:rPr>
-        <w:t>Fig. 1.4: [Insert screenshot - global page search results]</w:t>
-      </w:r>
-    </w:p>
-    <w:p>
-      <w:pPr>
-        <w:pStyle w:val="Heading3"/>
-        <w:keepNext w:val="true"/>
-        <w:keepLines/>
-        <w:rPr/>
-      </w:pPr>
-      <w:r>
-        <w:rPr/>
-        <w:t>Review notifications</w:t>
-      </w:r>
-    </w:p>
-    <w:p>
-      <w:pPr>
-        <w:pStyle w:val="Normal"/>
-        <w:keepNext w:val="false"/>
-        <w:keepLines/>
-        <w:spacing w:before="0" w:after="60"/>
-        <w:ind w:hanging="346" w:left="403"/>
-        <w:rPr/>
-      </w:pPr>
-      <w:r>
-        <w:rPr>
-          <w:b/>
-          <w:color w:val="185B3C"/>
-        </w:rPr>
-        <w:t xml:space="preserve">1. </w:t>
-      </w:r>
-      <w:r>
-        <w:rPr/>
-        <w:t>Select the notification bell in the top bar.</w:t>
-      </w:r>
-    </w:p>
-    <w:p>
-      <w:pPr>
-        <w:pStyle w:val="Normal"/>
-        <w:keepNext w:val="false"/>
-        <w:keepLines/>
-        <w:spacing w:before="0" w:after="60"/>
-        <w:ind w:hanging="346" w:left="403"/>
-        <w:rPr/>
-      </w:pPr>
-      <w:r>
-        <w:rPr>
-          <w:b/>
-          <w:color w:val="185B3C"/>
-        </w:rPr>
-        <w:t xml:space="preserve">2. </w:t>
-      </w:r>
-      <w:r>
-        <w:rPr/>
-        <w:t>Open an unread notification to review its record and mark it as read.</w:t>
-      </w:r>
-    </w:p>
-    <w:p>
-      <w:pPr>
-        <w:pStyle w:val="Normal"/>
-        <w:keepNext w:val="false"/>
-        <w:keepLines/>
-        <w:spacing w:before="0" w:after="60"/>
-        <w:ind w:hanging="346" w:left="403"/>
-        <w:rPr/>
-      </w:pPr>
-      <w:r>
-        <w:rPr>
-          <w:b/>
-          <w:color w:val="185B3C"/>
-        </w:rPr>
-        <w:t xml:space="preserve">3. </w:t>
-      </w:r>
-      <w:r>
-        <w:rPr/>
-        <w:t>Use the related page link when shown.</w:t>
-      </w:r>
-    </w:p>
-    <w:p>
-      <w:pPr>
-        <w:pStyle w:val="Normal"/>
-        <w:keepNext w:val="false"/>
-        <w:keepLines/>
-        <w:spacing w:before="0" w:after="60"/>
-        <w:ind w:hanging="346" w:left="403"/>
-        <w:rPr/>
-      </w:pPr>
-      <w:r>
-        <w:rPr>
-          <w:b/>
-          <w:color w:val="185B3C"/>
-        </w:rPr>
-        <w:t xml:space="preserve">4. </w:t>
-      </w:r>
-      <w:r>
-        <w:rPr/>
-        <w:t>Close the notification panel to return to the current page.</w:t>
-      </w:r>
-    </w:p>
-    <w:p>
-      <w:pPr>
-        <w:pStyle w:val="Normal"/>
-        <w:keepNext w:val="false"/>
-        <w:keepLines/>
-        <w:spacing w:before="80" w:after="200"/>
-        <w:rPr/>
       </w:pPr>
       <w:r>
         <w:rPr>
@@ -2378,225 +2357,19 @@
           <w:color w:val="545F58"/>
           <w:sz w:val="19"/>
         </w:rPr>
-        <w:t>Fig. 1.5: [Insert screenshot - notification centre]</w:t>
-      </w:r>
-    </w:p>
-    <w:p>
-      <w:pPr>
-        <w:pStyle w:val="Heading3"/>
-        <w:keepNext w:val="true"/>
-        <w:keepLines/>
-        <w:rPr/>
-      </w:pPr>
-      <w:r>
-        <w:rPr/>
-        <w:t>Change the password</w:t>
-      </w:r>
-    </w:p>
-    <w:p>
-      <w:pPr>
-        <w:pStyle w:val="Normal"/>
-        <w:keepNext w:val="false"/>
-        <w:keepLines/>
-        <w:spacing w:before="0" w:after="60"/>
-        <w:ind w:hanging="346" w:left="403"/>
-        <w:rPr/>
-      </w:pPr>
-      <w:r>
-        <w:rPr>
-          <w:b/>
-          <w:color w:val="185B3C"/>
-        </w:rPr>
-        <w:t xml:space="preserve">1. </w:t>
-      </w:r>
-      <w:r>
-        <w:rPr/>
-        <w:t>Open the account menu and select My access and security.</w:t>
-      </w:r>
-    </w:p>
-    <w:p>
-      <w:pPr>
-        <w:pStyle w:val="Normal"/>
-        <w:keepNext w:val="false"/>
-        <w:keepLines/>
-        <w:spacing w:before="0" w:after="60"/>
-        <w:ind w:hanging="346" w:left="403"/>
-        <w:rPr/>
-      </w:pPr>
-      <w:r>
-        <w:rPr>
-          <w:b/>
-          <w:color w:val="185B3C"/>
-        </w:rPr>
-        <w:t xml:space="preserve">2. </w:t>
-      </w:r>
-      <w:r>
-        <w:rPr/>
-        <w:t>Under Password, select Change password.</w:t>
-      </w:r>
-    </w:p>
-    <w:p>
-      <w:pPr>
-        <w:pStyle w:val="Normal"/>
-        <w:keepNext w:val="false"/>
-        <w:keepLines/>
-        <w:spacing w:before="0" w:after="60"/>
-        <w:ind w:hanging="346" w:left="403"/>
-        <w:rPr/>
-      </w:pPr>
-      <w:r>
-        <w:rPr>
-          <w:b/>
-          <w:color w:val="185B3C"/>
-        </w:rPr>
-        <w:t xml:space="preserve">3. </w:t>
-      </w:r>
-      <w:r>
-        <w:rPr/>
-        <w:t>Enter the current password, the new password, and the new password again.</w:t>
-      </w:r>
-    </w:p>
-    <w:p>
-      <w:pPr>
-        <w:pStyle w:val="Normal"/>
-        <w:keepNext w:val="false"/>
-        <w:keepLines/>
-        <w:spacing w:before="0" w:after="60"/>
-        <w:ind w:hanging="346" w:left="403"/>
-        <w:rPr/>
-      </w:pPr>
-      <w:r>
-        <w:rPr>
-          <w:b/>
-          <w:color w:val="185B3C"/>
-        </w:rPr>
-        <w:t xml:space="preserve">4. </w:t>
-      </w:r>
-      <w:r>
-        <w:rPr/>
-        <w:t>Meet every password rule displayed on the page, then select Update password.</w:t>
-      </w:r>
-    </w:p>
-    <w:p>
-      <w:pPr>
-        <w:pStyle w:val="Normal"/>
-        <w:keepNext w:val="false"/>
-        <w:keepLines/>
-        <w:spacing w:before="0" w:after="60"/>
-        <w:ind w:hanging="346" w:left="403"/>
-        <w:rPr/>
-      </w:pPr>
-      <w:r>
-        <w:rPr>
-          <w:b/>
-          <w:color w:val="185B3C"/>
-        </w:rPr>
-        <w:t xml:space="preserve">5. </w:t>
-      </w:r>
-      <w:r>
-        <w:rPr/>
-        <w:t>Sign in with the new password on the next session.</w:t>
-      </w:r>
-    </w:p>
-    <w:p>
-      <w:pPr>
-        <w:pStyle w:val="Normal"/>
-        <w:keepNext w:val="false"/>
-        <w:keepLines/>
+        <w:t>Fig. 1.4: global page search results</w:t>
+      </w:r>
+    </w:p>
+    <w:p>
+      <w:pPr>
+        <w:pStyle w:val="Normal"/>
         <w:spacing w:before="80" w:after="200"/>
-        <w:rPr/>
-      </w:pPr>
-      <w:r>
-        <w:rPr>
+        <w:rPr>
+          <w:i/>
           <w:i/>
           <w:color w:val="545F58"/>
           <w:sz w:val="19"/>
         </w:rPr>
-        <w:t>Fig. 1.6: [Insert screenshot - Change password panel]</w:t>
-      </w:r>
-    </w:p>
-    <w:p>
-      <w:pPr>
-        <w:pStyle w:val="Heading3"/>
-        <w:keepNext w:val="true"/>
-        <w:keepLines/>
-        <w:rPr/>
-      </w:pPr>
-      <w:r>
-        <w:rPr/>
-        <w:t>Check access and sign out</w:t>
-      </w:r>
-    </w:p>
-    <w:p>
-      <w:pPr>
-        <w:pStyle w:val="Normal"/>
-        <w:keepNext w:val="false"/>
-        <w:keepLines/>
-        <w:spacing w:before="0" w:after="60"/>
-        <w:ind w:hanging="346" w:left="403"/>
-        <w:rPr/>
-      </w:pPr>
-      <w:r>
-        <w:rPr>
-          <w:b/>
-          <w:color w:val="185B3C"/>
-        </w:rPr>
-        <w:t xml:space="preserve">1. </w:t>
-      </w:r>
-      <w:r>
-        <w:rPr/>
-        <w:t>Open My access and security to review the account's modules and actions.</w:t>
-      </w:r>
-    </w:p>
-    <w:p>
-      <w:pPr>
-        <w:pStyle w:val="Normal"/>
-        <w:keepNext w:val="false"/>
-        <w:keepLines/>
-        <w:spacing w:before="0" w:after="60"/>
-        <w:ind w:hanging="346" w:left="403"/>
-        <w:rPr/>
-      </w:pPr>
-      <w:r>
-        <w:rPr>
-          <w:b/>
-          <w:color w:val="185B3C"/>
-        </w:rPr>
-        <w:t xml:space="preserve">2. </w:t>
-      </w:r>
-      <w:r>
-        <w:rPr/>
-        <w:t>Open Help from the top bar when a page instruction is needed.</w:t>
-      </w:r>
-    </w:p>
-    <w:p>
-      <w:pPr>
-        <w:pStyle w:val="Normal"/>
-        <w:keepNext w:val="false"/>
-        <w:keepLines/>
-        <w:spacing w:before="0" w:after="60"/>
-        <w:ind w:hanging="346" w:left="403"/>
-        <w:rPr/>
-      </w:pPr>
-      <w:r>
-        <w:rPr>
-          <w:b/>
-          <w:color w:val="185B3C"/>
-        </w:rPr>
-        <w:t xml:space="preserve">3. </w:t>
-      </w:r>
-      <w:r>
-        <w:rPr/>
-        <w:t>Open the account menu and select Sign out when work is complete.</w:t>
-      </w:r>
-    </w:p>
-    <w:p>
-      <w:pPr>
-        <w:pStyle w:val="Normal"/>
-        <w:keepNext w:val="false"/>
-        <w:keepLines/>
-        <w:spacing w:before="80" w:after="200"/>
-        <w:rPr/>
       </w:pPr>
       <w:r>
         <w:rPr>
@@ -2604,16 +2377,630 @@
           <w:color w:val="545F58"/>
           <w:sz w:val="19"/>
         </w:rPr>
-        <w:t>Fig. 1.7: [Insert screenshot - account menu and My access page]</w:t>
-      </w:r>
-    </w:p>
-    <w:p>
-      <w:pPr>
-        <w:pStyle w:val="Normal"/>
-        <w:rPr/>
-      </w:pPr>
-      <w:r>
-        <w:rPr/>
+        <w:drawing>
+          <wp:anchor behindDoc="0" distT="0" distB="0" distL="0" distR="0" simplePos="0" locked="0" layoutInCell="0" allowOverlap="1" relativeHeight="5">
+            <wp:simplePos x="0" y="0"/>
+            <wp:positionH relativeFrom="column">
+              <wp:align>center</wp:align>
+            </wp:positionH>
+            <wp:positionV relativeFrom="paragraph">
+              <wp:posOffset>635</wp:posOffset>
+            </wp:positionV>
+            <wp:extent cx="6272530" cy="2940050"/>
+            <wp:effectExtent l="0" t="0" r="0" b="0"/>
+            <wp:wrapSquare wrapText="largest"/>
+            <wp:docPr id="4" name="Image4" descr=""/>
+            <wp:cNvGraphicFramePr>
+              <a:graphicFrameLocks xmlns:a="http://schemas.openxmlformats.org/drawingml/2006/main" noChangeAspect="1"/>
+            </wp:cNvGraphicFramePr>
+            <a:graphic xmlns:a="http://schemas.openxmlformats.org/drawingml/2006/main">
+              <a:graphicData uri="http://schemas.openxmlformats.org/drawingml/2006/picture">
+                <pic:pic xmlns:pic="http://schemas.openxmlformats.org/drawingml/2006/picture">
+                  <pic:nvPicPr>
+                    <pic:cNvPr id="4" name="Image4" descr=""/>
+                    <pic:cNvPicPr>
+                      <a:picLocks noChangeAspect="1" noChangeArrowheads="1"/>
+                    </pic:cNvPicPr>
+                  </pic:nvPicPr>
+                  <pic:blipFill>
+                    <a:blip r:embed="rId5"/>
+                    <a:stretch>
+                      <a:fillRect/>
+                    </a:stretch>
+                  </pic:blipFill>
+                  <pic:spPr bwMode="auto">
+                    <a:xfrm>
+                      <a:off x="0" y="0"/>
+                      <a:ext cx="6272530" cy="2940050"/>
+                    </a:xfrm>
+                    <a:prstGeom prst="rect">
+                      <a:avLst/>
+                    </a:prstGeom>
+                    <a:noFill/>
+                  </pic:spPr>
+                </pic:pic>
+              </a:graphicData>
+            </a:graphic>
+          </wp:anchor>
+        </w:drawing>
+      </w:r>
+    </w:p>
+    <w:p>
+      <w:pPr>
+        <w:pStyle w:val="Heading3"/>
+        <w:keepNext w:val="true"/>
+        <w:keepLines/>
+        <w:rPr/>
+      </w:pPr>
+      <w:r>
+        <w:rPr/>
+        <w:t>Review notifications</w:t>
+      </w:r>
+    </w:p>
+    <w:p>
+      <w:pPr>
+        <w:pStyle w:val="Normal"/>
+        <w:keepNext w:val="false"/>
+        <w:keepLines/>
+        <w:spacing w:before="0" w:after="60"/>
+        <w:ind w:hanging="346" w:left="403"/>
+        <w:rPr/>
+      </w:pPr>
+      <w:r>
+        <w:rPr>
+          <w:b/>
+          <w:color w:val="185B3C"/>
+        </w:rPr>
+        <w:t xml:space="preserve">1. </w:t>
+      </w:r>
+      <w:r>
+        <w:rPr/>
+        <w:t>Select the notification bell in the top bar.</w:t>
+      </w:r>
+    </w:p>
+    <w:p>
+      <w:pPr>
+        <w:pStyle w:val="Normal"/>
+        <w:keepNext w:val="false"/>
+        <w:keepLines/>
+        <w:spacing w:before="0" w:after="60"/>
+        <w:ind w:hanging="346" w:left="403"/>
+        <w:rPr/>
+      </w:pPr>
+      <w:r>
+        <w:rPr>
+          <w:b/>
+          <w:color w:val="185B3C"/>
+        </w:rPr>
+        <w:t xml:space="preserve">2. </w:t>
+      </w:r>
+      <w:r>
+        <w:rPr/>
+        <w:t>Open an unread notification to review its record and mark it as read.</w:t>
+      </w:r>
+    </w:p>
+    <w:p>
+      <w:pPr>
+        <w:pStyle w:val="Normal"/>
+        <w:keepNext w:val="false"/>
+        <w:keepLines/>
+        <w:spacing w:before="0" w:after="60"/>
+        <w:ind w:hanging="346" w:left="403"/>
+        <w:rPr/>
+      </w:pPr>
+      <w:r>
+        <w:rPr>
+          <w:b/>
+          <w:color w:val="185B3C"/>
+        </w:rPr>
+        <w:t xml:space="preserve">3. </w:t>
+      </w:r>
+      <w:r>
+        <w:rPr/>
+        <w:t>Use the related page link when shown.</w:t>
+      </w:r>
+    </w:p>
+    <w:p>
+      <w:pPr>
+        <w:pStyle w:val="Normal"/>
+        <w:keepNext w:val="false"/>
+        <w:keepLines/>
+        <w:spacing w:before="0" w:after="60"/>
+        <w:ind w:hanging="346" w:left="403"/>
+        <w:rPr/>
+      </w:pPr>
+      <w:r>
+        <w:rPr>
+          <w:b/>
+          <w:color w:val="185B3C"/>
+        </w:rPr>
+        <w:t xml:space="preserve">4. </w:t>
+      </w:r>
+      <w:r>
+        <w:rPr/>
+        <w:t>Close the notification panel to return to the current page.</w:t>
+      </w:r>
+    </w:p>
+    <w:p>
+      <w:pPr>
+        <w:pStyle w:val="Normal"/>
+        <w:keepNext w:val="false"/>
+        <w:keepLines/>
+        <w:spacing w:before="80" w:after="200"/>
+        <w:rPr>
+          <w:i/>
+          <w:i/>
+          <w:color w:val="545F58"/>
+          <w:sz w:val="19"/>
+        </w:rPr>
+      </w:pPr>
+      <w:r>
+        <w:rPr>
+          <w:i/>
+          <w:color w:val="545F58"/>
+          <w:sz w:val="19"/>
+        </w:rPr>
+        <w:t>Fig. 1.5: notification centre</w:t>
+      </w:r>
+    </w:p>
+    <w:p>
+      <w:pPr>
+        <w:pStyle w:val="Normal"/>
+        <w:spacing w:before="80" w:after="200"/>
+        <w:rPr>
+          <w:i/>
+          <w:i/>
+          <w:color w:val="545F58"/>
+          <w:sz w:val="19"/>
+        </w:rPr>
+      </w:pPr>
+      <w:r>
+        <w:rPr>
+          <w:i/>
+          <w:color w:val="545F58"/>
+          <w:sz w:val="19"/>
+        </w:rPr>
+        <w:drawing>
+          <wp:anchor behindDoc="0" distT="0" distB="0" distL="0" distR="0" simplePos="0" locked="0" layoutInCell="0" allowOverlap="1" relativeHeight="6">
+            <wp:simplePos x="0" y="0"/>
+            <wp:positionH relativeFrom="column">
+              <wp:align>center</wp:align>
+            </wp:positionH>
+            <wp:positionV relativeFrom="paragraph">
+              <wp:posOffset>635</wp:posOffset>
+            </wp:positionV>
+            <wp:extent cx="6272530" cy="2945765"/>
+            <wp:effectExtent l="0" t="0" r="0" b="0"/>
+            <wp:wrapSquare wrapText="largest"/>
+            <wp:docPr id="5" name="Image5" descr=""/>
+            <wp:cNvGraphicFramePr>
+              <a:graphicFrameLocks xmlns:a="http://schemas.openxmlformats.org/drawingml/2006/main" noChangeAspect="1"/>
+            </wp:cNvGraphicFramePr>
+            <a:graphic xmlns:a="http://schemas.openxmlformats.org/drawingml/2006/main">
+              <a:graphicData uri="http://schemas.openxmlformats.org/drawingml/2006/picture">
+                <pic:pic xmlns:pic="http://schemas.openxmlformats.org/drawingml/2006/picture">
+                  <pic:nvPicPr>
+                    <pic:cNvPr id="5" name="Image5" descr=""/>
+                    <pic:cNvPicPr>
+                      <a:picLocks noChangeAspect="1" noChangeArrowheads="1"/>
+                    </pic:cNvPicPr>
+                  </pic:nvPicPr>
+                  <pic:blipFill>
+                    <a:blip r:embed="rId6"/>
+                    <a:stretch>
+                      <a:fillRect/>
+                    </a:stretch>
+                  </pic:blipFill>
+                  <pic:spPr bwMode="auto">
+                    <a:xfrm>
+                      <a:off x="0" y="0"/>
+                      <a:ext cx="6272530" cy="2945765"/>
+                    </a:xfrm>
+                    <a:prstGeom prst="rect">
+                      <a:avLst/>
+                    </a:prstGeom>
+                    <a:noFill/>
+                  </pic:spPr>
+                </pic:pic>
+              </a:graphicData>
+            </a:graphic>
+          </wp:anchor>
+        </w:drawing>
+      </w:r>
+    </w:p>
+    <w:p>
+      <w:pPr>
+        <w:pStyle w:val="Heading3"/>
+        <w:keepNext w:val="true"/>
+        <w:keepLines/>
+        <w:rPr/>
+      </w:pPr>
+      <w:r>
+        <w:rPr/>
+        <w:t>Change the password</w:t>
+      </w:r>
+    </w:p>
+    <w:p>
+      <w:pPr>
+        <w:pStyle w:val="Normal"/>
+        <w:keepNext w:val="false"/>
+        <w:keepLines/>
+        <w:spacing w:before="0" w:after="60"/>
+        <w:ind w:hanging="346" w:left="403"/>
+        <w:rPr/>
+      </w:pPr>
+      <w:r>
+        <w:rPr>
+          <w:b/>
+          <w:color w:val="185B3C"/>
+        </w:rPr>
+        <w:t xml:space="preserve">1. </w:t>
+      </w:r>
+      <w:r>
+        <w:rPr/>
+        <w:t xml:space="preserve">Open the account menu and select </w:t>
+      </w:r>
+      <w:r>
+        <w:rPr>
+          <w:b/>
+          <w:bCs/>
+        </w:rPr>
+        <w:t>My access and security</w:t>
+      </w:r>
+      <w:r>
+        <w:rPr/>
+        <w:t>.</w:t>
+      </w:r>
+    </w:p>
+    <w:p>
+      <w:pPr>
+        <w:pStyle w:val="Normal"/>
+        <w:keepNext w:val="false"/>
+        <w:keepLines/>
+        <w:spacing w:before="0" w:after="60"/>
+        <w:ind w:hanging="346" w:left="403"/>
+        <w:rPr/>
+      </w:pPr>
+      <w:r>
+        <w:rPr>
+          <w:b/>
+          <w:color w:val="185B3C"/>
+        </w:rPr>
+        <w:t xml:space="preserve">2. </w:t>
+      </w:r>
+      <w:r>
+        <w:rPr/>
+        <w:t xml:space="preserve">Under Password, select </w:t>
+      </w:r>
+      <w:r>
+        <w:rPr>
+          <w:b/>
+          <w:bCs/>
+        </w:rPr>
+        <w:t>Change password</w:t>
+      </w:r>
+      <w:r>
+        <w:rPr/>
+        <w:t>.</w:t>
+      </w:r>
+    </w:p>
+    <w:p>
+      <w:pPr>
+        <w:pStyle w:val="Normal"/>
+        <w:keepNext w:val="false"/>
+        <w:keepLines/>
+        <w:spacing w:before="0" w:after="60"/>
+        <w:ind w:hanging="346" w:left="403"/>
+        <w:rPr/>
+      </w:pPr>
+      <w:r>
+        <w:rPr>
+          <w:b/>
+          <w:color w:val="185B3C"/>
+        </w:rPr>
+        <w:t xml:space="preserve">3. </w:t>
+      </w:r>
+      <w:r>
+        <w:rPr/>
+        <w:t>Enter the current password, the new password, and the new password again.</w:t>
+      </w:r>
+    </w:p>
+    <w:p>
+      <w:pPr>
+        <w:pStyle w:val="Normal"/>
+        <w:keepNext w:val="false"/>
+        <w:keepLines/>
+        <w:spacing w:before="0" w:after="60"/>
+        <w:ind w:hanging="346" w:left="403"/>
+        <w:rPr/>
+      </w:pPr>
+      <w:r>
+        <w:rPr>
+          <w:b/>
+          <w:color w:val="185B3C"/>
+        </w:rPr>
+        <w:t xml:space="preserve">4. </w:t>
+      </w:r>
+      <w:r>
+        <w:rPr/>
+        <w:t>Meet every password rule displayed on the page, then select Update password.</w:t>
+      </w:r>
+    </w:p>
+    <w:p>
+      <w:pPr>
+        <w:pStyle w:val="Normal"/>
+        <w:keepNext w:val="false"/>
+        <w:keepLines/>
+        <w:spacing w:before="0" w:after="60"/>
+        <w:ind w:hanging="346" w:left="403"/>
+        <w:rPr/>
+      </w:pPr>
+      <w:r>
+        <w:rPr>
+          <w:b/>
+          <w:color w:val="185B3C"/>
+        </w:rPr>
+        <w:t xml:space="preserve">5. </w:t>
+      </w:r>
+      <w:r>
+        <w:rPr/>
+        <w:t>Sign in with the new password on the next session.</w:t>
+      </w:r>
+    </w:p>
+    <w:p>
+      <w:pPr>
+        <w:pStyle w:val="Normal"/>
+        <w:keepNext w:val="false"/>
+        <w:keepLines/>
+        <w:spacing w:before="80" w:after="200"/>
+        <w:rPr>
+          <w:i/>
+          <w:i/>
+          <w:color w:val="545F58"/>
+          <w:sz w:val="19"/>
+        </w:rPr>
+      </w:pPr>
+      <w:r>
+        <w:rPr>
+          <w:i/>
+          <w:color w:val="545F58"/>
+          <w:sz w:val="19"/>
+        </w:rPr>
+        <w:t>Fig. 1.6: Change password panel</w:t>
+      </w:r>
+    </w:p>
+    <w:p>
+      <w:pPr>
+        <w:pStyle w:val="Normal"/>
+        <w:spacing w:before="80" w:after="200"/>
+        <w:rPr>
+          <w:i/>
+          <w:i/>
+          <w:color w:val="545F58"/>
+          <w:sz w:val="19"/>
+        </w:rPr>
+      </w:pPr>
+      <w:r>
+        <w:rPr>
+          <w:i/>
+          <w:color w:val="545F58"/>
+          <w:sz w:val="19"/>
+        </w:rPr>
+        <w:drawing>
+          <wp:anchor behindDoc="0" distT="0" distB="0" distL="0" distR="0" simplePos="0" locked="0" layoutInCell="0" allowOverlap="1" relativeHeight="7">
+            <wp:simplePos x="0" y="0"/>
+            <wp:positionH relativeFrom="column">
+              <wp:align>center</wp:align>
+            </wp:positionH>
+            <wp:positionV relativeFrom="paragraph">
+              <wp:posOffset>635</wp:posOffset>
+            </wp:positionV>
+            <wp:extent cx="6272530" cy="2951480"/>
+            <wp:effectExtent l="0" t="0" r="0" b="0"/>
+            <wp:wrapSquare wrapText="largest"/>
+            <wp:docPr id="6" name="Image6" descr=""/>
+            <wp:cNvGraphicFramePr>
+              <a:graphicFrameLocks xmlns:a="http://schemas.openxmlformats.org/drawingml/2006/main" noChangeAspect="1"/>
+            </wp:cNvGraphicFramePr>
+            <a:graphic xmlns:a="http://schemas.openxmlformats.org/drawingml/2006/main">
+              <a:graphicData uri="http://schemas.openxmlformats.org/drawingml/2006/picture">
+                <pic:pic xmlns:pic="http://schemas.openxmlformats.org/drawingml/2006/picture">
+                  <pic:nvPicPr>
+                    <pic:cNvPr id="6" name="Image6" descr=""/>
+                    <pic:cNvPicPr>
+                      <a:picLocks noChangeAspect="1" noChangeArrowheads="1"/>
+                    </pic:cNvPicPr>
+                  </pic:nvPicPr>
+                  <pic:blipFill>
+                    <a:blip r:embed="rId7"/>
+                    <a:stretch>
+                      <a:fillRect/>
+                    </a:stretch>
+                  </pic:blipFill>
+                  <pic:spPr bwMode="auto">
+                    <a:xfrm>
+                      <a:off x="0" y="0"/>
+                      <a:ext cx="6272530" cy="2951480"/>
+                    </a:xfrm>
+                    <a:prstGeom prst="rect">
+                      <a:avLst/>
+                    </a:prstGeom>
+                    <a:noFill/>
+                  </pic:spPr>
+                </pic:pic>
+              </a:graphicData>
+            </a:graphic>
+          </wp:anchor>
+        </w:drawing>
+      </w:r>
+    </w:p>
+    <w:p>
+      <w:pPr>
+        <w:pStyle w:val="Heading3"/>
+        <w:keepNext w:val="true"/>
+        <w:keepLines/>
+        <w:rPr/>
+      </w:pPr>
+      <w:r>
+        <w:rPr/>
+        <w:t>Check access and sign out</w:t>
+      </w:r>
+    </w:p>
+    <w:p>
+      <w:pPr>
+        <w:pStyle w:val="Normal"/>
+        <w:keepNext w:val="false"/>
+        <w:keepLines/>
+        <w:spacing w:before="0" w:after="60"/>
+        <w:ind w:hanging="346" w:left="403"/>
+        <w:rPr/>
+      </w:pPr>
+      <w:r>
+        <w:rPr>
+          <w:b/>
+          <w:color w:val="185B3C"/>
+        </w:rPr>
+        <w:t xml:space="preserve">1. </w:t>
+      </w:r>
+      <w:r>
+        <w:rPr/>
+        <w:t xml:space="preserve">Open </w:t>
+      </w:r>
+      <w:r>
+        <w:rPr>
+          <w:b/>
+          <w:bCs/>
+        </w:rPr>
+        <w:t xml:space="preserve">My access and security </w:t>
+      </w:r>
+      <w:r>
+        <w:rPr/>
+        <w:t>to review the account's modules and actions.</w:t>
+      </w:r>
+    </w:p>
+    <w:p>
+      <w:pPr>
+        <w:pStyle w:val="Normal"/>
+        <w:keepNext w:val="false"/>
+        <w:keepLines/>
+        <w:spacing w:before="0" w:after="60"/>
+        <w:ind w:hanging="346" w:left="403"/>
+        <w:rPr/>
+      </w:pPr>
+      <w:r>
+        <w:rPr>
+          <w:b/>
+          <w:color w:val="185B3C"/>
+        </w:rPr>
+        <w:t xml:space="preserve">2. </w:t>
+      </w:r>
+      <w:r>
+        <w:rPr/>
+        <w:t xml:space="preserve">Open </w:t>
+      </w:r>
+      <w:r>
+        <w:rPr>
+          <w:b/>
+          <w:bCs/>
+        </w:rPr>
+        <w:t>Help</w:t>
+      </w:r>
+      <w:r>
+        <w:rPr/>
+        <w:t xml:space="preserve"> from the top bar when a page instruction is needed.</w:t>
+      </w:r>
+    </w:p>
+    <w:p>
+      <w:pPr>
+        <w:pStyle w:val="Normal"/>
+        <w:keepNext w:val="false"/>
+        <w:keepLines/>
+        <w:spacing w:before="0" w:after="60"/>
+        <w:ind w:hanging="346" w:left="403"/>
+        <w:rPr/>
+      </w:pPr>
+      <w:r>
+        <w:rPr>
+          <w:b/>
+          <w:color w:val="185B3C"/>
+        </w:rPr>
+        <w:t xml:space="preserve">3. </w:t>
+      </w:r>
+      <w:r>
+        <w:rPr/>
+        <w:t>Open the account menu and select Sign out when work is complete.</w:t>
+      </w:r>
+    </w:p>
+    <w:p>
+      <w:pPr>
+        <w:pStyle w:val="Normal"/>
+        <w:keepNext w:val="false"/>
+        <w:keepLines/>
+        <w:spacing w:before="80" w:after="200"/>
+        <w:rPr/>
+      </w:pPr>
+      <w:r>
+        <w:rPr>
+          <w:i/>
+          <w:color w:val="545F58"/>
+          <w:sz w:val="19"/>
+        </w:rPr>
+        <w:t>Fig. 1.7: account menu and My access page</w:t>
+      </w:r>
+    </w:p>
+    <w:p>
+      <w:pPr>
+        <w:pStyle w:val="Normal"/>
+        <w:rPr/>
+      </w:pPr>
+      <w:r>
+        <w:rPr/>
+        <w:drawing>
+          <wp:anchor behindDoc="0" distT="0" distB="0" distL="0" distR="0" simplePos="0" locked="0" layoutInCell="0" allowOverlap="1" relativeHeight="8">
+            <wp:simplePos x="0" y="0"/>
+            <wp:positionH relativeFrom="column">
+              <wp:align>center</wp:align>
+            </wp:positionH>
+            <wp:positionV relativeFrom="paragraph">
+              <wp:posOffset>635</wp:posOffset>
+            </wp:positionV>
+            <wp:extent cx="6272530" cy="2990850"/>
+            <wp:effectExtent l="0" t="0" r="0" b="0"/>
+            <wp:wrapSquare wrapText="largest"/>
+            <wp:docPr id="7" name="Image7" descr=""/>
+            <wp:cNvGraphicFramePr>
+              <a:graphicFrameLocks xmlns:a="http://schemas.openxmlformats.org/drawingml/2006/main" noChangeAspect="1"/>
+            </wp:cNvGraphicFramePr>
+            <a:graphic xmlns:a="http://schemas.openxmlformats.org/drawingml/2006/main">
+              <a:graphicData uri="http://schemas.openxmlformats.org/drawingml/2006/picture">
+                <pic:pic xmlns:pic="http://schemas.openxmlformats.org/drawingml/2006/picture">
+                  <pic:nvPicPr>
+                    <pic:cNvPr id="7" name="Image7" descr=""/>
+                    <pic:cNvPicPr>
+                      <a:picLocks noChangeAspect="1" noChangeArrowheads="1"/>
+                    </pic:cNvPicPr>
+                  </pic:nvPicPr>
+                  <pic:blipFill>
+                    <a:blip r:embed="rId8"/>
+                    <a:stretch>
+                      <a:fillRect/>
+                    </a:stretch>
+                  </pic:blipFill>
+                  <pic:spPr bwMode="auto">
+                    <a:xfrm>
+                      <a:off x="0" y="0"/>
+                      <a:ext cx="6272530" cy="2990850"/>
+                    </a:xfrm>
+                    <a:prstGeom prst="rect">
+                      <a:avLst/>
+                    </a:prstGeom>
+                    <a:noFill/>
+                  </pic:spPr>
+                </pic:pic>
+              </a:graphicData>
+            </a:graphic>
+          </wp:anchor>
+        </w:drawing>
       </w:r>
       <w:r>
         <w:br w:type="page"/>
@@ -2690,7 +3077,29 @@
       </w:r>
       <w:r>
         <w:rPr/>
-        <w:t>Open Administration, then Security.</w:t>
+        <w:t xml:space="preserve">Open </w:t>
+      </w:r>
+      <w:r>
+        <w:rPr>
+          <w:b w:val="false"/>
+          <w:bCs w:val="false"/>
+        </w:rPr>
+        <w:t>Administration</w:t>
+      </w:r>
+      <w:r>
+        <w:rPr/>
+        <w:t xml:space="preserve">, then </w:t>
+      </w:r>
+      <w:r>
+        <w:rPr>
+          <w:b/>
+          <w:bCs/>
+        </w:rPr>
+        <w:t>Security</w:t>
+      </w:r>
+      <w:r>
+        <w:rPr/>
+        <w:t>.</w:t>
       </w:r>
     </w:p>
     <w:p>
@@ -2711,7 +3120,29 @@
       </w:r>
       <w:r>
         <w:rPr/>
-        <w:t>Select Employees, then Add employee.</w:t>
+        <w:t xml:space="preserve">Select </w:t>
+      </w:r>
+      <w:r>
+        <w:rPr>
+          <w:b/>
+          <w:bCs/>
+        </w:rPr>
+        <w:t>Employees</w:t>
+      </w:r>
+      <w:r>
+        <w:rPr/>
+        <w:t xml:space="preserve">, then </w:t>
+      </w:r>
+      <w:r>
+        <w:rPr>
+          <w:b/>
+          <w:bCs/>
+        </w:rPr>
+        <w:t>Add employee</w:t>
+      </w:r>
+      <w:r>
+        <w:rPr/>
+        <w:t>.</w:t>
       </w:r>
     </w:p>
     <w:p>
@@ -4481,6 +4912,7 @@
             <w:pPr>
               <w:pStyle w:val="Normal"/>
               <w:widowControl/>
+              <w:suppressAutoHyphens w:val="true"/>
               <w:spacing w:before="0" w:after="120"/>
               <w:jc w:val="left"/>
               <w:rPr>
@@ -4514,6 +4946,7 @@
             <w:pPr>
               <w:pStyle w:val="Normal"/>
               <w:widowControl/>
+              <w:suppressAutoHyphens w:val="true"/>
               <w:spacing w:before="0" w:after="120"/>
               <w:jc w:val="left"/>
               <w:rPr>
@@ -4549,6 +4982,7 @@
             <w:pPr>
               <w:pStyle w:val="Normal"/>
               <w:widowControl/>
+              <w:suppressAutoHyphens w:val="true"/>
               <w:spacing w:before="0" w:after="0"/>
               <w:jc w:val="left"/>
               <w:rPr>
@@ -4579,6 +5013,7 @@
             <w:pPr>
               <w:pStyle w:val="Normal"/>
               <w:widowControl/>
+              <w:suppressAutoHyphens w:val="true"/>
               <w:spacing w:before="0" w:after="0"/>
               <w:jc w:val="left"/>
               <w:rPr>
@@ -4613,6 +5048,7 @@
             <w:pPr>
               <w:pStyle w:val="Normal"/>
               <w:widowControl/>
+              <w:suppressAutoHyphens w:val="true"/>
               <w:spacing w:before="0" w:after="0"/>
               <w:jc w:val="left"/>
               <w:rPr>
@@ -4644,6 +5080,7 @@
             <w:pPr>
               <w:pStyle w:val="Normal"/>
               <w:widowControl/>
+              <w:suppressAutoHyphens w:val="true"/>
               <w:spacing w:before="0" w:after="0"/>
               <w:jc w:val="left"/>
               <w:rPr>
@@ -4677,6 +5114,7 @@
             <w:pPr>
               <w:pStyle w:val="Normal"/>
               <w:widowControl/>
+              <w:suppressAutoHyphens w:val="true"/>
               <w:spacing w:before="0" w:after="0"/>
               <w:jc w:val="left"/>
               <w:rPr>
@@ -4707,6 +5145,7 @@
             <w:pPr>
               <w:pStyle w:val="Normal"/>
               <w:widowControl/>
+              <w:suppressAutoHyphens w:val="true"/>
               <w:spacing w:before="0" w:after="0"/>
               <w:jc w:val="left"/>
               <w:rPr>
@@ -4741,6 +5180,7 @@
             <w:pPr>
               <w:pStyle w:val="Normal"/>
               <w:widowControl/>
+              <w:suppressAutoHyphens w:val="true"/>
               <w:spacing w:before="0" w:after="0"/>
               <w:jc w:val="left"/>
               <w:rPr>
@@ -4772,6 +5212,7 @@
             <w:pPr>
               <w:pStyle w:val="Normal"/>
               <w:widowControl/>
+              <w:suppressAutoHyphens w:val="true"/>
               <w:spacing w:before="0" w:after="0"/>
               <w:jc w:val="left"/>
               <w:rPr>
@@ -4805,6 +5246,7 @@
             <w:pPr>
               <w:pStyle w:val="Normal"/>
               <w:widowControl/>
+              <w:suppressAutoHyphens w:val="true"/>
               <w:spacing w:before="0" w:after="0"/>
               <w:jc w:val="left"/>
               <w:rPr>
@@ -4835,6 +5277,7 @@
             <w:pPr>
               <w:pStyle w:val="Normal"/>
               <w:widowControl/>
+              <w:suppressAutoHyphens w:val="true"/>
               <w:spacing w:before="0" w:after="0"/>
               <w:jc w:val="left"/>
               <w:rPr>
@@ -4869,6 +5312,7 @@
             <w:pPr>
               <w:pStyle w:val="Normal"/>
               <w:widowControl/>
+              <w:suppressAutoHyphens w:val="true"/>
               <w:spacing w:before="0" w:after="0"/>
               <w:jc w:val="left"/>
               <w:rPr>
@@ -4900,6 +5344,7 @@
             <w:pPr>
               <w:pStyle w:val="Normal"/>
               <w:widowControl/>
+              <w:suppressAutoHyphens w:val="true"/>
               <w:spacing w:before="0" w:after="0"/>
               <w:jc w:val="left"/>
               <w:rPr>
@@ -4933,6 +5378,7 @@
             <w:pPr>
               <w:pStyle w:val="Normal"/>
               <w:widowControl/>
+              <w:suppressAutoHyphens w:val="true"/>
               <w:spacing w:before="0" w:after="0"/>
               <w:jc w:val="left"/>
               <w:rPr>
@@ -4963,6 +5409,7 @@
             <w:pPr>
               <w:pStyle w:val="Normal"/>
               <w:widowControl/>
+              <w:suppressAutoHyphens w:val="true"/>
               <w:spacing w:before="0" w:after="0"/>
               <w:jc w:val="left"/>
               <w:rPr>
@@ -4997,6 +5444,7 @@
             <w:pPr>
               <w:pStyle w:val="Normal"/>
               <w:widowControl/>
+              <w:suppressAutoHyphens w:val="true"/>
               <w:spacing w:before="0" w:after="0"/>
               <w:jc w:val="left"/>
               <w:rPr>
@@ -5028,6 +5476,7 @@
             <w:pPr>
               <w:pStyle w:val="Normal"/>
               <w:widowControl/>
+              <w:suppressAutoHyphens w:val="true"/>
               <w:spacing w:before="0" w:after="0"/>
               <w:jc w:val="left"/>
               <w:rPr>
@@ -5061,6 +5510,7 @@
             <w:pPr>
               <w:pStyle w:val="Normal"/>
               <w:widowControl/>
+              <w:suppressAutoHyphens w:val="true"/>
               <w:spacing w:before="0" w:after="0"/>
               <w:jc w:val="left"/>
               <w:rPr>
@@ -5091,6 +5541,7 @@
             <w:pPr>
               <w:pStyle w:val="Normal"/>
               <w:widowControl/>
+              <w:suppressAutoHyphens w:val="true"/>
               <w:spacing w:before="0" w:after="0"/>
               <w:jc w:val="left"/>
               <w:rPr>
@@ -18467,6 +18918,7 @@
             <w:pPr>
               <w:pStyle w:val="Normal"/>
               <w:widowControl/>
+              <w:suppressAutoHyphens w:val="true"/>
               <w:spacing w:before="0" w:after="120"/>
               <w:jc w:val="left"/>
               <w:rPr>
@@ -18500,6 +18952,7 @@
             <w:pPr>
               <w:pStyle w:val="Normal"/>
               <w:widowControl/>
+              <w:suppressAutoHyphens w:val="true"/>
               <w:spacing w:before="0" w:after="120"/>
               <w:jc w:val="left"/>
               <w:rPr>
@@ -18535,6 +18988,7 @@
             <w:pPr>
               <w:pStyle w:val="Normal"/>
               <w:widowControl/>
+              <w:suppressAutoHyphens w:val="true"/>
               <w:spacing w:before="0" w:after="0"/>
               <w:jc w:val="left"/>
               <w:rPr>
@@ -18565,6 +19019,7 @@
             <w:pPr>
               <w:pStyle w:val="Normal"/>
               <w:widowControl/>
+              <w:suppressAutoHyphens w:val="true"/>
               <w:spacing w:before="0" w:after="0"/>
               <w:jc w:val="left"/>
               <w:rPr>
@@ -18599,6 +19054,7 @@
             <w:pPr>
               <w:pStyle w:val="Normal"/>
               <w:widowControl/>
+              <w:suppressAutoHyphens w:val="true"/>
               <w:spacing w:before="0" w:after="0"/>
               <w:jc w:val="left"/>
               <w:rPr>
@@ -18630,6 +19086,7 @@
             <w:pPr>
               <w:pStyle w:val="Normal"/>
               <w:widowControl/>
+              <w:suppressAutoHyphens w:val="true"/>
               <w:spacing w:before="0" w:after="0"/>
               <w:jc w:val="left"/>
               <w:rPr>
@@ -18663,6 +19120,7 @@
             <w:pPr>
               <w:pStyle w:val="Normal"/>
               <w:widowControl/>
+              <w:suppressAutoHyphens w:val="true"/>
               <w:spacing w:before="0" w:after="0"/>
               <w:jc w:val="left"/>
               <w:rPr>
@@ -18693,6 +19151,7 @@
             <w:pPr>
               <w:pStyle w:val="Normal"/>
               <w:widowControl/>
+              <w:suppressAutoHyphens w:val="true"/>
               <w:spacing w:before="0" w:after="0"/>
               <w:jc w:val="left"/>
               <w:rPr>
@@ -18727,6 +19186,7 @@
             <w:pPr>
               <w:pStyle w:val="Normal"/>
               <w:widowControl/>
+              <w:suppressAutoHyphens w:val="true"/>
               <w:spacing w:before="0" w:after="0"/>
               <w:jc w:val="left"/>
               <w:rPr>
@@ -18758,6 +19218,7 @@
             <w:pPr>
               <w:pStyle w:val="Normal"/>
               <w:widowControl/>
+              <w:suppressAutoHyphens w:val="true"/>
               <w:spacing w:before="0" w:after="0"/>
               <w:jc w:val="left"/>
               <w:rPr>
@@ -18791,6 +19252,7 @@
             <w:pPr>
               <w:pStyle w:val="Normal"/>
               <w:widowControl/>
+              <w:suppressAutoHyphens w:val="true"/>
               <w:spacing w:before="0" w:after="0"/>
               <w:jc w:val="left"/>
               <w:rPr>
@@ -18821,6 +19283,7 @@
             <w:pPr>
               <w:pStyle w:val="Normal"/>
               <w:widowControl/>
+              <w:suppressAutoHyphens w:val="true"/>
               <w:spacing w:before="0" w:after="0"/>
               <w:jc w:val="left"/>
               <w:rPr>
@@ -18855,6 +19318,7 @@
             <w:pPr>
               <w:pStyle w:val="Normal"/>
               <w:widowControl/>
+              <w:suppressAutoHyphens w:val="true"/>
               <w:spacing w:before="0" w:after="0"/>
               <w:jc w:val="left"/>
               <w:rPr>
@@ -18886,6 +19350,7 @@
             <w:pPr>
               <w:pStyle w:val="Normal"/>
               <w:widowControl/>
+              <w:suppressAutoHyphens w:val="true"/>
               <w:spacing w:before="0" w:after="0"/>
               <w:jc w:val="left"/>
               <w:rPr>
@@ -18919,6 +19384,7 @@
             <w:pPr>
               <w:pStyle w:val="Normal"/>
               <w:widowControl/>
+              <w:suppressAutoHyphens w:val="true"/>
               <w:spacing w:before="0" w:after="0"/>
               <w:jc w:val="left"/>
               <w:rPr>
@@ -18949,6 +19415,7 @@
             <w:pPr>
               <w:pStyle w:val="Normal"/>
               <w:widowControl/>
+              <w:suppressAutoHyphens w:val="true"/>
               <w:spacing w:before="0" w:after="0"/>
               <w:jc w:val="left"/>
               <w:rPr>
@@ -18983,6 +19450,7 @@
             <w:pPr>
               <w:pStyle w:val="Normal"/>
               <w:widowControl/>
+              <w:suppressAutoHyphens w:val="true"/>
               <w:spacing w:before="0" w:after="0"/>
               <w:jc w:val="left"/>
               <w:rPr>
@@ -19014,6 +19482,7 @@
             <w:pPr>
               <w:pStyle w:val="Normal"/>
               <w:widowControl/>
+              <w:suppressAutoHyphens w:val="true"/>
               <w:spacing w:before="0" w:after="0"/>
               <w:jc w:val="left"/>
               <w:rPr>
@@ -19115,6 +19584,7 @@
             <w:pPr>
               <w:pStyle w:val="Normal"/>
               <w:widowControl/>
+              <w:suppressAutoHyphens w:val="true"/>
               <w:spacing w:before="0" w:after="120"/>
               <w:jc w:val="left"/>
               <w:rPr>
@@ -19148,6 +19618,7 @@
             <w:pPr>
               <w:pStyle w:val="Normal"/>
               <w:widowControl/>
+              <w:suppressAutoHyphens w:val="true"/>
               <w:spacing w:before="0" w:after="120"/>
               <w:jc w:val="left"/>
               <w:rPr>
@@ -19183,6 +19654,7 @@
             <w:pPr>
               <w:pStyle w:val="Normal"/>
               <w:widowControl/>
+              <w:suppressAutoHyphens w:val="true"/>
               <w:spacing w:before="0" w:after="0"/>
               <w:jc w:val="left"/>
               <w:rPr>
@@ -19213,6 +19685,7 @@
             <w:pPr>
               <w:pStyle w:val="Normal"/>
               <w:widowControl/>
+              <w:suppressAutoHyphens w:val="true"/>
               <w:spacing w:before="0" w:after="0"/>
               <w:jc w:val="left"/>
               <w:rPr>
@@ -19247,6 +19720,7 @@
             <w:pPr>
               <w:pStyle w:val="Normal"/>
               <w:widowControl/>
+              <w:suppressAutoHyphens w:val="true"/>
               <w:spacing w:before="0" w:after="0"/>
               <w:jc w:val="left"/>
               <w:rPr>
@@ -19278,6 +19752,7 @@
             <w:pPr>
               <w:pStyle w:val="Normal"/>
               <w:widowControl/>
+              <w:suppressAutoHyphens w:val="true"/>
               <w:spacing w:before="0" w:after="0"/>
               <w:jc w:val="left"/>
               <w:rPr>
@@ -19311,6 +19786,7 @@
             <w:pPr>
               <w:pStyle w:val="Normal"/>
               <w:widowControl/>
+              <w:suppressAutoHyphens w:val="true"/>
               <w:spacing w:before="0" w:after="0"/>
               <w:jc w:val="left"/>
               <w:rPr>
@@ -19341,6 +19817,7 @@
             <w:pPr>
               <w:pStyle w:val="Normal"/>
               <w:widowControl/>
+              <w:suppressAutoHyphens w:val="true"/>
               <w:spacing w:before="0" w:after="0"/>
               <w:jc w:val="left"/>
               <w:rPr>
@@ -19375,6 +19852,7 @@
             <w:pPr>
               <w:pStyle w:val="Normal"/>
               <w:widowControl/>
+              <w:suppressAutoHyphens w:val="true"/>
               <w:spacing w:before="0" w:after="0"/>
               <w:jc w:val="left"/>
               <w:rPr>
@@ -19406,6 +19884,7 @@
             <w:pPr>
               <w:pStyle w:val="Normal"/>
               <w:widowControl/>
+              <w:suppressAutoHyphens w:val="true"/>
               <w:spacing w:before="0" w:after="0"/>
               <w:jc w:val="left"/>
               <w:rPr>
@@ -19439,6 +19918,7 @@
             <w:pPr>
               <w:pStyle w:val="Normal"/>
               <w:widowControl/>
+              <w:suppressAutoHyphens w:val="true"/>
               <w:spacing w:before="0" w:after="0"/>
               <w:jc w:val="left"/>
               <w:rPr>
@@ -19469,6 +19949,7 @@
             <w:pPr>
               <w:pStyle w:val="Normal"/>
               <w:widowControl/>
+              <w:suppressAutoHyphens w:val="true"/>
               <w:spacing w:before="0" w:after="0"/>
               <w:jc w:val="left"/>
               <w:rPr>
@@ -19503,6 +19984,7 @@
             <w:pPr>
               <w:pStyle w:val="Normal"/>
               <w:widowControl/>
+              <w:suppressAutoHyphens w:val="true"/>
               <w:spacing w:before="0" w:after="0"/>
               <w:jc w:val="left"/>
               <w:rPr>
@@ -19534,6 +20016,7 @@
             <w:pPr>
               <w:pStyle w:val="Normal"/>
               <w:widowControl/>
+              <w:suppressAutoHyphens w:val="true"/>
               <w:spacing w:before="0" w:after="0"/>
               <w:jc w:val="left"/>
               <w:rPr>
@@ -19567,6 +20050,7 @@
             <w:pPr>
               <w:pStyle w:val="Normal"/>
               <w:widowControl/>
+              <w:suppressAutoHyphens w:val="true"/>
               <w:spacing w:before="0" w:after="0"/>
               <w:jc w:val="left"/>
               <w:rPr>
@@ -19597,6 +20081,7 @@
             <w:pPr>
               <w:pStyle w:val="Normal"/>
               <w:widowControl/>
+              <w:suppressAutoHyphens w:val="true"/>
               <w:spacing w:before="0" w:after="0"/>
               <w:jc w:val="left"/>
               <w:rPr>
@@ -19664,12 +20149,12 @@
       </w:r>
     </w:p>
     <w:sectPr>
-      <w:headerReference w:type="even" r:id="rId4"/>
-      <w:headerReference w:type="default" r:id="rId5"/>
-      <w:headerReference w:type="first" r:id="rId6"/>
-      <w:footerReference w:type="even" r:id="rId7"/>
-      <w:footerReference w:type="default" r:id="rId8"/>
-      <w:footerReference w:type="first" r:id="rId9"/>
+      <w:headerReference w:type="even" r:id="rId9"/>
+      <w:headerReference w:type="default" r:id="rId10"/>
+      <w:headerReference w:type="first" r:id="rId11"/>
+      <w:footerReference w:type="even" r:id="rId12"/>
+      <w:footerReference w:type="default" r:id="rId13"/>
+      <w:footerReference w:type="first" r:id="rId14"/>
       <w:type w:val="nextPage"/>
       <w:pgSz w:w="12240" w:h="15840"/>
       <w:pgMar w:left="1181" w:right="1181" w:gutter="0" w:header="720" w:top="1037" w:footer="720" w:bottom="979"/>
@@ -19729,7 +20214,7 @@
     </w:r>
     <w:r>
       <w:rPr/>
-      <w:t>3</w:t>
+      <w:t>6</w:t>
     </w:r>
     <w:r>
       <w:rPr/>
@@ -19772,7 +20257,7 @@
     </w:r>
     <w:r>
       <w:rPr/>
-      <w:t>3</w:t>
+      <w:t>6</w:t>
     </w:r>
     <w:r>
       <w:rPr/>
@@ -19863,6 +20348,7 @@
         </w:tabs>
         <w:ind w:left="1080" w:hanging="360"/>
       </w:pPr>
+      <w:rPr/>
     </w:lvl>
     <w:lvl w:ilvl="2">
       <w:start w:val="1"/>
@@ -19875,6 +20361,7 @@
         </w:tabs>
         <w:ind w:left="1440" w:hanging="360"/>
       </w:pPr>
+      <w:rPr/>
     </w:lvl>
     <w:lvl w:ilvl="3">
       <w:start w:val="1"/>
@@ -19887,6 +20374,7 @@
         </w:tabs>
         <w:ind w:left="1800" w:hanging="360"/>
       </w:pPr>
+      <w:rPr/>
     </w:lvl>
     <w:lvl w:ilvl="4">
       <w:start w:val="1"/>
@@ -19899,6 +20387,7 @@
         </w:tabs>
         <w:ind w:left="2160" w:hanging="360"/>
       </w:pPr>
+      <w:rPr/>
     </w:lvl>
     <w:lvl w:ilvl="5">
       <w:start w:val="1"/>
@@ -19911,6 +20400,7 @@
         </w:tabs>
         <w:ind w:left="2520" w:hanging="360"/>
       </w:pPr>
+      <w:rPr/>
     </w:lvl>
     <w:lvl w:ilvl="6">
       <w:start w:val="1"/>
@@ -19923,6 +20413,7 @@
         </w:tabs>
         <w:ind w:left="2880" w:hanging="360"/>
       </w:pPr>
+      <w:rPr/>
     </w:lvl>
     <w:lvl w:ilvl="7">
       <w:start w:val="1"/>
@@ -19935,6 +20426,7 @@
         </w:tabs>
         <w:ind w:left="3240" w:hanging="360"/>
       </w:pPr>
+      <w:rPr/>
     </w:lvl>
     <w:lvl w:ilvl="8">
       <w:start w:val="1"/>
@@ -19947,6 +20439,7 @@
         </w:tabs>
         <w:ind w:left="3600" w:hanging="360"/>
       </w:pPr>
+      <w:rPr/>
     </w:lvl>
   </w:abstractNum>
   <w:abstractNum w:abstractNumId="2">
@@ -19976,6 +20469,7 @@
         </w:tabs>
         <w:ind w:left="1080" w:hanging="360"/>
       </w:pPr>
+      <w:rPr/>
     </w:lvl>
     <w:lvl w:ilvl="2">
       <w:start w:val="1"/>
@@ -19988,6 +20482,7 @@
         </w:tabs>
         <w:ind w:left="1440" w:hanging="360"/>
       </w:pPr>
+      <w:rPr/>
     </w:lvl>
     <w:lvl w:ilvl="3">
       <w:start w:val="1"/>
@@ -20000,6 +20495,7 @@
         </w:tabs>
         <w:ind w:left="1800" w:hanging="360"/>
       </w:pPr>
+      <w:rPr/>
     </w:lvl>
     <w:lvl w:ilvl="4">
       <w:start w:val="1"/>
@@ -20012,6 +20508,7 @@
         </w:tabs>
         <w:ind w:left="2160" w:hanging="360"/>
       </w:pPr>
+      <w:rPr/>
     </w:lvl>
     <w:lvl w:ilvl="5">
       <w:start w:val="1"/>
@@ -20024,6 +20521,7 @@
         </w:tabs>
         <w:ind w:left="2520" w:hanging="360"/>
       </w:pPr>
+      <w:rPr/>
     </w:lvl>
     <w:lvl w:ilvl="6">
       <w:start w:val="1"/>
@@ -20036,6 +20534,7 @@
         </w:tabs>
         <w:ind w:left="2880" w:hanging="360"/>
       </w:pPr>
+      <w:rPr/>
     </w:lvl>
     <w:lvl w:ilvl="7">
       <w:start w:val="1"/>
@@ -20048,6 +20547,7 @@
         </w:tabs>
         <w:ind w:left="3240" w:hanging="360"/>
       </w:pPr>
+      <w:rPr/>
     </w:lvl>
     <w:lvl w:ilvl="8">
       <w:start w:val="1"/>
@@ -20060,6 +20560,7 @@
         </w:tabs>
         <w:ind w:left="3600" w:hanging="360"/>
       </w:pPr>
+      <w:rPr/>
     </w:lvl>
   </w:abstractNum>
   <w:abstractNum w:abstractNumId="3">
@@ -20089,6 +20590,7 @@
         </w:tabs>
         <w:ind w:left="1080" w:hanging="360"/>
       </w:pPr>
+      <w:rPr/>
     </w:lvl>
     <w:lvl w:ilvl="2">
       <w:start w:val="1"/>
@@ -20101,6 +20603,7 @@
         </w:tabs>
         <w:ind w:left="1440" w:hanging="360"/>
       </w:pPr>
+      <w:rPr/>
     </w:lvl>
     <w:lvl w:ilvl="3">
       <w:start w:val="1"/>
@@ -20113,6 +20616,7 @@
         </w:tabs>
         <w:ind w:left="1800" w:hanging="360"/>
       </w:pPr>
+      <w:rPr/>
     </w:lvl>
     <w:lvl w:ilvl="4">
       <w:start w:val="1"/>
@@ -20125,6 +20629,7 @@
         </w:tabs>
         <w:ind w:left="2160" w:hanging="360"/>
       </w:pPr>
+      <w:rPr/>
     </w:lvl>
     <w:lvl w:ilvl="5">
       <w:start w:val="1"/>
@@ -20137,6 +20642,7 @@
         </w:tabs>
         <w:ind w:left="2520" w:hanging="360"/>
       </w:pPr>
+      <w:rPr/>
     </w:lvl>
     <w:lvl w:ilvl="6">
       <w:start w:val="1"/>
@@ -20149,6 +20655,7 @@
         </w:tabs>
         <w:ind w:left="2880" w:hanging="360"/>
       </w:pPr>
+      <w:rPr/>
     </w:lvl>
     <w:lvl w:ilvl="7">
       <w:start w:val="1"/>
@@ -20161,6 +20668,7 @@
         </w:tabs>
         <w:ind w:left="3240" w:hanging="360"/>
       </w:pPr>
+      <w:rPr/>
     </w:lvl>
     <w:lvl w:ilvl="8">
       <w:start w:val="1"/>
@@ -20173,6 +20681,7 @@
         </w:tabs>
         <w:ind w:left="3600" w:hanging="360"/>
       </w:pPr>
+      <w:rPr/>
     </w:lvl>
   </w:abstractNum>
   <w:abstractNum w:abstractNumId="4">
@@ -20200,6 +20709,7 @@
         </w:tabs>
         <w:ind w:left="1080" w:hanging="360"/>
       </w:pPr>
+      <w:rPr/>
     </w:lvl>
     <w:lvl w:ilvl="2">
       <w:start w:val="1"/>
@@ -20212,6 +20722,7 @@
         </w:tabs>
         <w:ind w:left="1440" w:hanging="360"/>
       </w:pPr>
+      <w:rPr/>
     </w:lvl>
     <w:lvl w:ilvl="3">
       <w:start w:val="1"/>
@@ -20224,6 +20735,7 @@
         </w:tabs>
         <w:ind w:left="1800" w:hanging="360"/>
       </w:pPr>
+      <w:rPr/>
     </w:lvl>
     <w:lvl w:ilvl="4">
       <w:start w:val="1"/>
@@ -20236,6 +20748,7 @@
         </w:tabs>
         <w:ind w:left="2160" w:hanging="360"/>
       </w:pPr>
+      <w:rPr/>
     </w:lvl>
     <w:lvl w:ilvl="5">
       <w:start w:val="1"/>
@@ -20248,6 +20761,7 @@
         </w:tabs>
         <w:ind w:left="2520" w:hanging="360"/>
       </w:pPr>
+      <w:rPr/>
     </w:lvl>
     <w:lvl w:ilvl="6">
       <w:start w:val="1"/>
@@ -20260,6 +20774,7 @@
         </w:tabs>
         <w:ind w:left="2880" w:hanging="360"/>
       </w:pPr>
+      <w:rPr/>
     </w:lvl>
     <w:lvl w:ilvl="7">
       <w:start w:val="1"/>
@@ -20272,6 +20787,7 @@
         </w:tabs>
         <w:ind w:left="3240" w:hanging="360"/>
       </w:pPr>
+      <w:rPr/>
     </w:lvl>
     <w:lvl w:ilvl="8">
       <w:start w:val="1"/>
@@ -20284,6 +20800,7 @@
         </w:tabs>
         <w:ind w:left="3600" w:hanging="360"/>
       </w:pPr>
+      <w:rPr/>
     </w:lvl>
   </w:abstractNum>
   <w:abstractNum w:abstractNumId="5">
@@ -20311,6 +20828,7 @@
         </w:tabs>
         <w:ind w:left="1080" w:hanging="360"/>
       </w:pPr>
+      <w:rPr/>
     </w:lvl>
     <w:lvl w:ilvl="2">
       <w:start w:val="1"/>
@@ -20323,6 +20841,7 @@
         </w:tabs>
         <w:ind w:left="1440" w:hanging="360"/>
       </w:pPr>
+      <w:rPr/>
     </w:lvl>
     <w:lvl w:ilvl="3">
       <w:start w:val="1"/>
@@ -20335,6 +20854,7 @@
         </w:tabs>
         <w:ind w:left="1800" w:hanging="360"/>
       </w:pPr>
+      <w:rPr/>
     </w:lvl>
     <w:lvl w:ilvl="4">
       <w:start w:val="1"/>
@@ -20347,6 +20867,7 @@
         </w:tabs>
         <w:ind w:left="2160" w:hanging="360"/>
       </w:pPr>
+      <w:rPr/>
     </w:lvl>
     <w:lvl w:ilvl="5">
       <w:start w:val="1"/>
@@ -20359,6 +20880,7 @@
         </w:tabs>
         <w:ind w:left="2520" w:hanging="360"/>
       </w:pPr>
+      <w:rPr/>
     </w:lvl>
     <w:lvl w:ilvl="6">
       <w:start w:val="1"/>
@@ -20371,6 +20893,7 @@
         </w:tabs>
         <w:ind w:left="2880" w:hanging="360"/>
       </w:pPr>
+      <w:rPr/>
     </w:lvl>
     <w:lvl w:ilvl="7">
       <w:start w:val="1"/>
@@ -20383,6 +20906,7 @@
         </w:tabs>
         <w:ind w:left="3240" w:hanging="360"/>
       </w:pPr>
+      <w:rPr/>
     </w:lvl>
     <w:lvl w:ilvl="8">
       <w:start w:val="1"/>
@@ -20395,6 +20919,7 @@
         </w:tabs>
         <w:ind w:left="3600" w:hanging="360"/>
       </w:pPr>
+      <w:rPr/>
     </w:lvl>
   </w:abstractNum>
   <w:abstractNum w:abstractNumId="6">
@@ -20422,6 +20947,7 @@
         </w:tabs>
         <w:ind w:left="1080" w:hanging="360"/>
       </w:pPr>
+      <w:rPr/>
     </w:lvl>
     <w:lvl w:ilvl="2">
       <w:start w:val="1"/>
@@ -20434,6 +20960,7 @@
         </w:tabs>
         <w:ind w:left="1440" w:hanging="360"/>
       </w:pPr>
+      <w:rPr/>
     </w:lvl>
     <w:lvl w:ilvl="3">
       <w:start w:val="1"/>
@@ -20446,6 +20973,7 @@
         </w:tabs>
         <w:ind w:left="1800" w:hanging="360"/>
       </w:pPr>
+      <w:rPr/>
     </w:lvl>
     <w:lvl w:ilvl="4">
       <w:start w:val="1"/>
@@ -20458,6 +20986,7 @@
         </w:tabs>
         <w:ind w:left="2160" w:hanging="360"/>
       </w:pPr>
+      <w:rPr/>
     </w:lvl>
     <w:lvl w:ilvl="5">
       <w:start w:val="1"/>
@@ -20470,6 +20999,7 @@
         </w:tabs>
         <w:ind w:left="2520" w:hanging="360"/>
       </w:pPr>
+      <w:rPr/>
     </w:lvl>
     <w:lvl w:ilvl="6">
       <w:start w:val="1"/>
@@ -20482,6 +21012,7 @@
         </w:tabs>
         <w:ind w:left="2880" w:hanging="360"/>
       </w:pPr>
+      <w:rPr/>
     </w:lvl>
     <w:lvl w:ilvl="7">
       <w:start w:val="1"/>
@@ -20494,6 +21025,7 @@
         </w:tabs>
         <w:ind w:left="3240" w:hanging="360"/>
       </w:pPr>
+      <w:rPr/>
     </w:lvl>
     <w:lvl w:ilvl="8">
       <w:start w:val="1"/>
@@ -20506,6 +21038,7 @@
         </w:tabs>
         <w:ind w:left="3600" w:hanging="360"/>
       </w:pPr>
+      <w:rPr/>
     </w:lvl>
   </w:abstractNum>
   <w:abstractNum w:abstractNumId="7">
@@ -20656,7 +21189,7 @@
   <w:docDefaults>
     <w:rPrDefault>
       <w:rPr>
-        <w:rFonts w:ascii="Cambria" w:hAnsi="Cambria" w:eastAsia="ＭＳ 明朝" w:cs="" w:asciiTheme="minorHAnsi" w:cstheme="minorBidi" w:eastAsiaTheme="minorEastAsia" w:hAnsiTheme="minorHAnsi"/>
+        <w:rFonts w:ascii="Cambria" w:hAnsi="Cambria" w:eastAsia="" w:cs="" w:asciiTheme="minorHAnsi" w:cstheme="minorBidi" w:eastAsiaTheme="minorEastAsia" w:hAnsiTheme="minorHAnsi"/>
         <w:sz w:val="22"/>
         <w:szCs w:val="22"/>
         <w:lang w:val="en-US" w:eastAsia="en-US" w:bidi="ar-SA"/>
@@ -20813,6 +21346,7 @@
     <w:rsid w:val="00fc693f"/>
     <w:pPr>
       <w:widowControl/>
+      <w:suppressAutoHyphens w:val="true"/>
       <w:bidi w:val="0"/>
       <w:spacing w:lineRule="auto" w:line="252" w:before="0" w:after="120"/>
       <w:jc w:val="left"/>
@@ -20841,7 +21375,7 @@
       <w:outlineLvl w:val="0"/>
     </w:pPr>
     <w:rPr>
-      <w:rFonts w:ascii="Calibri" w:hAnsi="Calibri" w:eastAsia="ＭＳ ゴシック" w:cs="" w:asciiTheme="majorHAnsi" w:cstheme="majorBidi" w:eastAsiaTheme="majorEastAsia" w:hAnsiTheme="majorHAnsi"/>
+      <w:rFonts w:ascii="Calibri" w:hAnsi="Calibri" w:eastAsia="" w:cs="" w:asciiTheme="majorHAnsi" w:cstheme="majorBidi" w:eastAsiaTheme="majorEastAsia" w:hAnsiTheme="majorHAnsi"/>
       <w:b/>
       <w:bCs/>
       <w:color w:val="000000"/>
@@ -20865,7 +21399,7 @@
       <w:outlineLvl w:val="1"/>
     </w:pPr>
     <w:rPr>
-      <w:rFonts w:ascii="Calibri" w:hAnsi="Calibri" w:eastAsia="ＭＳ ゴシック" w:cs="" w:asciiTheme="majorHAnsi" w:cstheme="majorBidi" w:eastAsiaTheme="majorEastAsia" w:hAnsiTheme="majorHAnsi"/>
+      <w:rFonts w:ascii="Calibri" w:hAnsi="Calibri" w:eastAsia="" w:cs="" w:asciiTheme="majorHAnsi" w:cstheme="majorBidi" w:eastAsiaTheme="majorEastAsia" w:hAnsiTheme="majorHAnsi"/>
       <w:b/>
       <w:bCs/>
       <w:color w:val="000000"/>
@@ -20889,7 +21423,7 @@
       <w:outlineLvl w:val="2"/>
     </w:pPr>
     <w:rPr>
-      <w:rFonts w:ascii="Calibri" w:hAnsi="Calibri" w:eastAsia="ＭＳ ゴシック" w:cs="" w:asciiTheme="majorHAnsi" w:cstheme="majorBidi" w:eastAsiaTheme="majorEastAsia" w:hAnsiTheme="majorHAnsi"/>
+      <w:rFonts w:ascii="Calibri" w:hAnsi="Calibri" w:eastAsia="" w:cs="" w:asciiTheme="majorHAnsi" w:cstheme="majorBidi" w:eastAsiaTheme="majorEastAsia" w:hAnsiTheme="majorHAnsi"/>
       <w:b/>
       <w:bCs/>
       <w:color w:val="000000"/>
@@ -20913,7 +21447,7 @@
       <w:outlineLvl w:val="3"/>
     </w:pPr>
     <w:rPr>
-      <w:rFonts w:ascii="Calibri" w:hAnsi="Calibri" w:eastAsia="ＭＳ ゴシック" w:cs="" w:asciiTheme="majorHAnsi" w:cstheme="majorBidi" w:eastAsiaTheme="majorEastAsia" w:hAnsiTheme="majorHAnsi"/>
+      <w:rFonts w:ascii="Calibri" w:hAnsi="Calibri" w:eastAsia="" w:cs="" w:asciiTheme="majorHAnsi" w:cstheme="majorBidi" w:eastAsiaTheme="majorEastAsia" w:hAnsiTheme="majorHAnsi"/>
       <w:b/>
       <w:bCs/>
       <w:i/>
@@ -20938,7 +21472,7 @@
       <w:outlineLvl w:val="4"/>
     </w:pPr>
     <w:rPr>
-      <w:rFonts w:ascii="Calibri" w:hAnsi="Calibri" w:eastAsia="ＭＳ ゴシック" w:cs="" w:asciiTheme="majorHAnsi" w:cstheme="majorBidi" w:eastAsiaTheme="majorEastAsia" w:hAnsiTheme="majorHAnsi"/>
+      <w:rFonts w:ascii="Calibri" w:hAnsi="Calibri" w:eastAsia="" w:cs="" w:asciiTheme="majorHAnsi" w:cstheme="majorBidi" w:eastAsiaTheme="majorEastAsia" w:hAnsiTheme="majorHAnsi"/>
       <w:color w:themeColor="accent1" w:themeShade="7f" w:val="243F60"/>
     </w:rPr>
   </w:style>
@@ -20959,7 +21493,7 @@
       <w:outlineLvl w:val="5"/>
     </w:pPr>
     <w:rPr>
-      <w:rFonts w:ascii="Calibri" w:hAnsi="Calibri" w:eastAsia="ＭＳ ゴシック" w:cs="" w:asciiTheme="majorHAnsi" w:cstheme="majorBidi" w:eastAsiaTheme="majorEastAsia" w:hAnsiTheme="majorHAnsi"/>
+      <w:rFonts w:ascii="Calibri" w:hAnsi="Calibri" w:eastAsia="" w:cs="" w:asciiTheme="majorHAnsi" w:cstheme="majorBidi" w:eastAsiaTheme="majorEastAsia" w:hAnsiTheme="majorHAnsi"/>
       <w:i/>
       <w:iCs/>
       <w:color w:themeColor="accent1" w:themeShade="7f" w:val="243F60"/>
@@ -20982,7 +21516,7 @@
       <w:outlineLvl w:val="6"/>
     </w:pPr>
     <w:rPr>
-      <w:rFonts w:ascii="Calibri" w:hAnsi="Calibri" w:eastAsia="ＭＳ ゴシック" w:cs="" w:asciiTheme="majorHAnsi" w:cstheme="majorBidi" w:eastAsiaTheme="majorEastAsia" w:hAnsiTheme="majorHAnsi"/>
+      <w:rFonts w:ascii="Calibri" w:hAnsi="Calibri" w:eastAsia="" w:cs="" w:asciiTheme="majorHAnsi" w:cstheme="majorBidi" w:eastAsiaTheme="majorEastAsia" w:hAnsiTheme="majorHAnsi"/>
       <w:i/>
       <w:iCs/>
       <w:color w:themeColor="text1" w:themeTint="bf" w:val="404040"/>
@@ -21005,7 +21539,7 @@
       <w:outlineLvl w:val="7"/>
     </w:pPr>
     <w:rPr>
-      <w:rFonts w:ascii="Calibri" w:hAnsi="Calibri" w:eastAsia="ＭＳ ゴシック" w:cs="" w:asciiTheme="majorHAnsi" w:cstheme="majorBidi" w:eastAsiaTheme="majorEastAsia" w:hAnsiTheme="majorHAnsi"/>
+      <w:rFonts w:ascii="Calibri" w:hAnsi="Calibri" w:eastAsia="" w:cs="" w:asciiTheme="majorHAnsi" w:cstheme="majorBidi" w:eastAsiaTheme="majorEastAsia" w:hAnsiTheme="majorHAnsi"/>
       <w:color w:themeColor="accent1" w:val="4F81BD"/>
       <w:sz w:val="20"/>
       <w:szCs w:val="20"/>
@@ -21028,7 +21562,7 @@
       <w:outlineLvl w:val="8"/>
     </w:pPr>
     <w:rPr>
-      <w:rFonts w:ascii="Calibri" w:hAnsi="Calibri" w:eastAsia="ＭＳ ゴシック" w:cs="" w:asciiTheme="majorHAnsi" w:cstheme="majorBidi" w:eastAsiaTheme="majorEastAsia" w:hAnsiTheme="majorHAnsi"/>
+      <w:rFonts w:ascii="Calibri" w:hAnsi="Calibri" w:eastAsia="" w:cs="" w:asciiTheme="majorHAnsi" w:cstheme="majorBidi" w:eastAsiaTheme="majorEastAsia" w:hAnsiTheme="majorHAnsi"/>
       <w:i/>
       <w:iCs/>
       <w:color w:themeColor="text1" w:themeTint="bf" w:val="404040"/>
@@ -21070,7 +21604,7 @@
     <w:qFormat/>
     <w:rsid w:val="00fc693f"/>
     <w:rPr>
-      <w:rFonts w:ascii="Calibri" w:hAnsi="Calibri" w:eastAsia="ＭＳ ゴシック" w:cs="" w:asciiTheme="majorHAnsi" w:cstheme="majorBidi" w:eastAsiaTheme="majorEastAsia" w:hAnsiTheme="majorHAnsi"/>
+      <w:rFonts w:ascii="Calibri" w:hAnsi="Calibri" w:eastAsia="" w:cs="" w:asciiTheme="majorHAnsi" w:cstheme="majorBidi" w:eastAsiaTheme="majorEastAsia" w:hAnsiTheme="majorHAnsi"/>
       <w:b/>
       <w:bCs/>
       <w:color w:themeColor="accent1" w:themeShade="bf" w:val="365F91"/>
@@ -21086,7 +21620,7 @@
     <w:qFormat/>
     <w:rsid w:val="00fc693f"/>
     <w:rPr>
-      <w:rFonts w:ascii="Calibri" w:hAnsi="Calibri" w:eastAsia="ＭＳ ゴシック" w:cs="" w:asciiTheme="majorHAnsi" w:cstheme="majorBidi" w:eastAsiaTheme="majorEastAsia" w:hAnsiTheme="majorHAnsi"/>
+      <w:rFonts w:ascii="Calibri" w:hAnsi="Calibri" w:eastAsia="" w:cs="" w:asciiTheme="majorHAnsi" w:cstheme="majorBidi" w:eastAsiaTheme="majorEastAsia" w:hAnsiTheme="majorHAnsi"/>
       <w:b/>
       <w:bCs/>
       <w:color w:themeColor="accent1" w:val="4F81BD"/>
@@ -21102,7 +21636,7 @@
     <w:qFormat/>
     <w:rsid w:val="00fc693f"/>
     <w:rPr>
-      <w:rFonts w:ascii="Calibri" w:hAnsi="Calibri" w:eastAsia="ＭＳ ゴシック" w:cs="" w:asciiTheme="majorHAnsi" w:cstheme="majorBidi" w:eastAsiaTheme="majorEastAsia" w:hAnsiTheme="majorHAnsi"/>
+      <w:rFonts w:ascii="Calibri" w:hAnsi="Calibri" w:eastAsia="" w:cs="" w:asciiTheme="majorHAnsi" w:cstheme="majorBidi" w:eastAsiaTheme="majorEastAsia" w:hAnsiTheme="majorHAnsi"/>
       <w:b/>
       <w:bCs/>
       <w:color w:themeColor="accent1" w:val="4F81BD"/>
@@ -21116,7 +21650,7 @@
     <w:qFormat/>
     <w:rsid w:val="00fc693f"/>
     <w:rPr>
-      <w:rFonts w:ascii="Calibri" w:hAnsi="Calibri" w:eastAsia="ＭＳ ゴシック" w:cs="" w:asciiTheme="majorHAnsi" w:cstheme="majorBidi" w:eastAsiaTheme="majorEastAsia" w:hAnsiTheme="majorHAnsi"/>
+      <w:rFonts w:ascii="Calibri" w:hAnsi="Calibri" w:eastAsia="" w:cs="" w:asciiTheme="majorHAnsi" w:cstheme="majorBidi" w:eastAsiaTheme="majorEastAsia" w:hAnsiTheme="majorHAnsi"/>
       <w:color w:themeColor="text2" w:themeShade="bf" w:val="17365D"/>
       <w:spacing w:val="5"/>
       <w:kern w:val="2"/>
@@ -21132,7 +21666,7 @@
     <w:qFormat/>
     <w:rsid w:val="00fc693f"/>
     <w:rPr>
-      <w:rFonts w:ascii="Calibri" w:hAnsi="Calibri" w:eastAsia="ＭＳ ゴシック" w:cs="" w:asciiTheme="majorHAnsi" w:cstheme="majorBidi" w:eastAsiaTheme="majorEastAsia" w:hAnsiTheme="majorHAnsi"/>
+      <w:rFonts w:ascii="Calibri" w:hAnsi="Calibri" w:eastAsia="" w:cs="" w:asciiTheme="majorHAnsi" w:cstheme="majorBidi" w:eastAsiaTheme="majorEastAsia" w:hAnsiTheme="majorHAnsi"/>
       <w:i/>
       <w:iCs/>
       <w:color w:themeColor="accent1" w:val="4F81BD"/>
@@ -21205,7 +21739,7 @@
     <w:qFormat/>
     <w:rsid w:val="00fc693f"/>
     <w:rPr>
-      <w:rFonts w:ascii="Calibri" w:hAnsi="Calibri" w:eastAsia="ＭＳ ゴシック" w:cs="" w:asciiTheme="majorHAnsi" w:cstheme="majorBidi" w:eastAsiaTheme="majorEastAsia" w:hAnsiTheme="majorHAnsi"/>
+      <w:rFonts w:ascii="Calibri" w:hAnsi="Calibri" w:eastAsia="" w:cs="" w:asciiTheme="majorHAnsi" w:cstheme="majorBidi" w:eastAsiaTheme="majorEastAsia" w:hAnsiTheme="majorHAnsi"/>
       <w:b/>
       <w:bCs/>
       <w:i/>
@@ -21222,7 +21756,7 @@
     <w:qFormat/>
     <w:rsid w:val="00fc693f"/>
     <w:rPr>
-      <w:rFonts w:ascii="Calibri" w:hAnsi="Calibri" w:eastAsia="ＭＳ ゴシック" w:cs="" w:asciiTheme="majorHAnsi" w:cstheme="majorBidi" w:eastAsiaTheme="majorEastAsia" w:hAnsiTheme="majorHAnsi"/>
+      <w:rFonts w:ascii="Calibri" w:hAnsi="Calibri" w:eastAsia="" w:cs="" w:asciiTheme="majorHAnsi" w:cstheme="majorBidi" w:eastAsiaTheme="majorEastAsia" w:hAnsiTheme="majorHAnsi"/>
       <w:color w:themeColor="accent1" w:themeShade="7f" w:val="243F60"/>
     </w:rPr>
   </w:style>
@@ -21235,7 +21769,7 @@
     <w:qFormat/>
     <w:rsid w:val="00fc693f"/>
     <w:rPr>
-      <w:rFonts w:ascii="Calibri" w:hAnsi="Calibri" w:eastAsia="ＭＳ ゴシック" w:cs="" w:asciiTheme="majorHAnsi" w:cstheme="majorBidi" w:eastAsiaTheme="majorEastAsia" w:hAnsiTheme="majorHAnsi"/>
+      <w:rFonts w:ascii="Calibri" w:hAnsi="Calibri" w:eastAsia="" w:cs="" w:asciiTheme="majorHAnsi" w:cstheme="majorBidi" w:eastAsiaTheme="majorEastAsia" w:hAnsiTheme="majorHAnsi"/>
       <w:i/>
       <w:iCs/>
       <w:color w:themeColor="accent1" w:themeShade="7f" w:val="243F60"/>
@@ -21250,7 +21784,7 @@
     <w:qFormat/>
     <w:rsid w:val="00fc693f"/>
     <w:rPr>
-      <w:rFonts w:ascii="Calibri" w:hAnsi="Calibri" w:eastAsia="ＭＳ ゴシック" w:cs="" w:asciiTheme="majorHAnsi" w:cstheme="majorBidi" w:eastAsiaTheme="majorEastAsia" w:hAnsiTheme="majorHAnsi"/>
+      <w:rFonts w:ascii="Calibri" w:hAnsi="Calibri" w:eastAsia="" w:cs="" w:asciiTheme="majorHAnsi" w:cstheme="majorBidi" w:eastAsiaTheme="majorEastAsia" w:hAnsiTheme="majorHAnsi"/>
       <w:i/>
       <w:iCs/>
       <w:color w:themeColor="text1" w:themeTint="bf" w:val="404040"/>
@@ -21265,7 +21799,7 @@
     <w:qFormat/>
     <w:rsid w:val="00fc693f"/>
     <w:rPr>
-      <w:rFonts w:ascii="Calibri" w:hAnsi="Calibri" w:eastAsia="ＭＳ ゴシック" w:cs="" w:asciiTheme="majorHAnsi" w:cstheme="majorBidi" w:eastAsiaTheme="majorEastAsia" w:hAnsiTheme="majorHAnsi"/>
+      <w:rFonts w:ascii="Calibri" w:hAnsi="Calibri" w:eastAsia="" w:cs="" w:asciiTheme="majorHAnsi" w:cstheme="majorBidi" w:eastAsiaTheme="majorEastAsia" w:hAnsiTheme="majorHAnsi"/>
       <w:color w:themeColor="accent1" w:val="4F81BD"/>
       <w:sz w:val="20"/>
       <w:szCs w:val="20"/>
@@ -21280,7 +21814,7 @@
     <w:qFormat/>
     <w:rsid w:val="00fc693f"/>
     <w:rPr>
-      <w:rFonts w:ascii="Calibri" w:hAnsi="Calibri" w:eastAsia="ＭＳ ゴシック" w:cs="" w:asciiTheme="majorHAnsi" w:cstheme="majorBidi" w:eastAsiaTheme="majorEastAsia" w:hAnsiTheme="majorHAnsi"/>
+      <w:rFonts w:ascii="Calibri" w:hAnsi="Calibri" w:eastAsia="" w:cs="" w:asciiTheme="majorHAnsi" w:cstheme="majorBidi" w:eastAsiaTheme="majorEastAsia" w:hAnsiTheme="majorHAnsi"/>
       <w:i/>
       <w:iCs/>
       <w:color w:themeColor="text1" w:themeTint="bf" w:val="404040"/>
@@ -21510,12 +22044,13 @@
     <w:rsid w:val="00fc693f"/>
     <w:pPr>
       <w:widowControl/>
+      <w:suppressAutoHyphens w:val="true"/>
       <w:bidi w:val="0"/>
       <w:spacing w:lineRule="auto" w:line="240" w:before="0" w:after="0"/>
       <w:jc w:val="left"/>
     </w:pPr>
     <w:rPr>
-      <w:rFonts w:ascii="Cambria" w:hAnsi="Cambria" w:eastAsia="ＭＳ 明朝" w:cs="" w:asciiTheme="minorHAnsi" w:cstheme="minorBidi" w:eastAsiaTheme="minorEastAsia" w:hAnsiTheme="minorHAnsi"/>
+      <w:rFonts w:ascii="Cambria" w:hAnsi="Cambria" w:eastAsia="" w:cs="" w:asciiTheme="minorHAnsi" w:cstheme="minorBidi" w:eastAsiaTheme="minorEastAsia" w:hAnsiTheme="minorHAnsi"/>
       <w:color w:val="auto"/>
       <w:kern w:val="0"/>
       <w:sz w:val="22"/>
@@ -21536,7 +22071,7 @@
       <w:contextualSpacing/>
     </w:pPr>
     <w:rPr>
-      <w:rFonts w:ascii="Calibri" w:hAnsi="Calibri" w:eastAsia="ＭＳ ゴシック" w:cs="" w:asciiTheme="majorHAnsi" w:cstheme="majorBidi" w:eastAsiaTheme="majorEastAsia" w:hAnsiTheme="majorHAnsi"/>
+      <w:rFonts w:ascii="Calibri" w:hAnsi="Calibri" w:eastAsia="" w:cs="" w:asciiTheme="majorHAnsi" w:cstheme="majorBidi" w:eastAsiaTheme="majorEastAsia" w:hAnsiTheme="majorHAnsi"/>
       <w:b/>
       <w:color w:val="000000"/>
       <w:spacing w:val="5"/>
@@ -21555,7 +22090,7 @@
     <w:rsid w:val="00fc693f"/>
     <w:pPr/>
     <w:rPr>
-      <w:rFonts w:ascii="Calibri" w:hAnsi="Calibri" w:eastAsia="ＭＳ ゴシック" w:cs="" w:asciiTheme="majorHAnsi" w:cstheme="majorBidi" w:eastAsiaTheme="majorEastAsia" w:hAnsiTheme="majorHAnsi"/>
+      <w:rFonts w:ascii="Calibri" w:hAnsi="Calibri" w:eastAsia="" w:cs="" w:asciiTheme="majorHAnsi" w:cstheme="majorBidi" w:eastAsiaTheme="majorEastAsia" w:hAnsiTheme="majorHAnsi"/>
       <w:i/>
       <w:iCs/>
       <w:color w:themeColor="accent1" w:val="4F81BD"/>
@@ -21788,12 +22323,13 @@
         <w:tab w:val="left" w:pos="3456" w:leader="none"/>
         <w:tab w:val="left" w:pos="4032" w:leader="none"/>
       </w:tabs>
+      <w:suppressAutoHyphens w:val="true"/>
       <w:bidi w:val="0"/>
       <w:spacing w:lineRule="auto" w:line="276" w:before="0" w:after="200"/>
       <w:jc w:val="left"/>
     </w:pPr>
     <w:rPr>
-      <w:rFonts w:ascii="Courier" w:hAnsi="Courier" w:eastAsia="ＭＳ 明朝" w:cs="" w:cstheme="minorBidi" w:eastAsiaTheme="minorEastAsia"/>
+      <w:rFonts w:ascii="Courier" w:hAnsi="Courier" w:eastAsia="" w:cs="" w:cstheme="minorBidi" w:eastAsiaTheme="minorEastAsia"/>
       <w:color w:val="auto"/>
       <w:kern w:val="0"/>
       <w:sz w:val="20"/>
@@ -24991,7 +25527,6 @@
       <w:pPr>
         <w:spacing w:before="0" w:after="0" w:line="240" w:lineRule="auto"/>
       </w:pPr>
-      <w:rPr/>
       <w:tblPr/>
       <w:tcPr>
         <w:tcBorders>
@@ -25137,7 +25672,6 @@
       <w:pPr>
         <w:spacing w:before="0" w:after="0" w:line="240" w:lineRule="auto"/>
       </w:pPr>
-      <w:rPr/>
       <w:tblPr/>
       <w:tcPr>
         <w:tcBorders>
@@ -25283,7 +25817,6 @@
       <w:pPr>
         <w:spacing w:before="0" w:after="0" w:line="240" w:lineRule="auto"/>
       </w:pPr>
-      <w:rPr/>
       <w:tblPr/>
       <w:tcPr>
         <w:tcBorders>
@@ -25429,7 +25962,6 @@
       <w:pPr>
         <w:spacing w:before="0" w:after="0" w:line="240" w:lineRule="auto"/>
       </w:pPr>
-      <w:rPr/>
       <w:tblPr/>
       <w:tcPr>
         <w:tcBorders>
@@ -25575,7 +26107,6 @@
       <w:pPr>
         <w:spacing w:before="0" w:after="0" w:line="240" w:lineRule="auto"/>
       </w:pPr>
-      <w:rPr/>
       <w:tblPr/>
       <w:tcPr>
         <w:tcBorders>
@@ -25721,7 +26252,6 @@
       <w:pPr>
         <w:spacing w:before="0" w:after="0" w:line="240" w:lineRule="auto"/>
       </w:pPr>
-      <w:rPr/>
       <w:tblPr/>
       <w:tcPr>
         <w:tcBorders>
@@ -25867,7 +26397,6 @@
       <w:pPr>
         <w:spacing w:before="0" w:after="0" w:line="240" w:lineRule="auto"/>
       </w:pPr>
-      <w:rPr/>
       <w:tblPr/>
       <w:tcPr>
         <w:tcBorders>

</xml_diff>